<commit_message>
correccion del word (soy pedro)
</commit_message>
<xml_diff>
--- a/Sprint1prog2/Justificacion_Sprint _1.doc.docx
+++ b/Sprint1prog2/Justificacion_Sprint _1.doc.docx
@@ -240,18 +240,46 @@
                 <w14:ligatures w14:val="none"/>
               </w:rPr>
             </w:pPr>
-            <w:r>
-              <w:rPr>
-                <w:rFonts w:ascii="Times New Roman" w:eastAsia="Times New Roman" w:hAnsi="Times New Roman" w:cs="Times New Roman"/>
-                <w:color w:val="000000"/>
-                <w:kern w:val="0"/>
-                <w:sz w:val="20"/>
-                <w:szCs w:val="20"/>
-                <w:lang w:eastAsia="es-AR"/>
-                <w14:ligatures w14:val="none"/>
-              </w:rPr>
-              <w:t>dni: int</w:t>
-            </w:r>
+            <w:proofErr w:type="spellStart"/>
+            <w:r>
+              <w:rPr>
+                <w:rFonts w:ascii="Times New Roman" w:eastAsia="Times New Roman" w:hAnsi="Times New Roman" w:cs="Times New Roman"/>
+                <w:color w:val="000000"/>
+                <w:kern w:val="0"/>
+                <w:sz w:val="20"/>
+                <w:szCs w:val="20"/>
+                <w:lang w:eastAsia="es-AR"/>
+                <w14:ligatures w14:val="none"/>
+              </w:rPr>
+              <w:t>dni</w:t>
+            </w:r>
+            <w:proofErr w:type="spellEnd"/>
+            <w:r>
+              <w:rPr>
+                <w:rFonts w:ascii="Times New Roman" w:eastAsia="Times New Roman" w:hAnsi="Times New Roman" w:cs="Times New Roman"/>
+                <w:color w:val="000000"/>
+                <w:kern w:val="0"/>
+                <w:sz w:val="20"/>
+                <w:szCs w:val="20"/>
+                <w:lang w:eastAsia="es-AR"/>
+                <w14:ligatures w14:val="none"/>
+              </w:rPr>
+              <w:t xml:space="preserve">: </w:t>
+            </w:r>
+            <w:proofErr w:type="spellStart"/>
+            <w:r>
+              <w:rPr>
+                <w:rFonts w:ascii="Times New Roman" w:eastAsia="Times New Roman" w:hAnsi="Times New Roman" w:cs="Times New Roman"/>
+                <w:color w:val="000000"/>
+                <w:kern w:val="0"/>
+                <w:sz w:val="20"/>
+                <w:szCs w:val="20"/>
+                <w:lang w:eastAsia="es-AR"/>
+                <w14:ligatures w14:val="none"/>
+              </w:rPr>
+              <w:t>int</w:t>
+            </w:r>
+            <w:proofErr w:type="spellEnd"/>
           </w:p>
           <w:p>
             <w:pPr>
@@ -274,8 +302,24 @@
                 <w:lang w:eastAsia="es-AR"/>
                 <w14:ligatures w14:val="none"/>
               </w:rPr>
-              <w:t xml:space="preserve"> nombre:String</w:t>
-            </w:r>
+              <w:t xml:space="preserve"> </w:t>
+            </w:r>
+            <w:proofErr w:type="spellStart"/>
+            <w:proofErr w:type="gramStart"/>
+            <w:r>
+              <w:rPr>
+                <w:rFonts w:ascii="Times New Roman" w:eastAsia="Times New Roman" w:hAnsi="Times New Roman" w:cs="Times New Roman"/>
+                <w:color w:val="000000"/>
+                <w:kern w:val="0"/>
+                <w:sz w:val="20"/>
+                <w:szCs w:val="20"/>
+                <w:lang w:eastAsia="es-AR"/>
+                <w14:ligatures w14:val="none"/>
+              </w:rPr>
+              <w:t>nombre:String</w:t>
+            </w:r>
+            <w:proofErr w:type="spellEnd"/>
+            <w:proofErr w:type="gramEnd"/>
           </w:p>
           <w:p>
             <w:pPr>
@@ -315,18 +359,46 @@
                 <w14:ligatures w14:val="none"/>
               </w:rPr>
             </w:pPr>
-            <w:r>
-              <w:rPr>
-                <w:rFonts w:ascii="Times New Roman" w:eastAsia="Times New Roman" w:hAnsi="Times New Roman" w:cs="Times New Roman"/>
-                <w:color w:val="000000"/>
-                <w:kern w:val="0"/>
-                <w:sz w:val="20"/>
-                <w:szCs w:val="20"/>
-                <w:lang w:eastAsia="es-AR"/>
-                <w14:ligatures w14:val="none"/>
-              </w:rPr>
-              <w:t>telefono: int</w:t>
-            </w:r>
+            <w:proofErr w:type="spellStart"/>
+            <w:r>
+              <w:rPr>
+                <w:rFonts w:ascii="Times New Roman" w:eastAsia="Times New Roman" w:hAnsi="Times New Roman" w:cs="Times New Roman"/>
+                <w:color w:val="000000"/>
+                <w:kern w:val="0"/>
+                <w:sz w:val="20"/>
+                <w:szCs w:val="20"/>
+                <w:lang w:eastAsia="es-AR"/>
+                <w14:ligatures w14:val="none"/>
+              </w:rPr>
+              <w:t>telefono</w:t>
+            </w:r>
+            <w:proofErr w:type="spellEnd"/>
+            <w:r>
+              <w:rPr>
+                <w:rFonts w:ascii="Times New Roman" w:eastAsia="Times New Roman" w:hAnsi="Times New Roman" w:cs="Times New Roman"/>
+                <w:color w:val="000000"/>
+                <w:kern w:val="0"/>
+                <w:sz w:val="20"/>
+                <w:szCs w:val="20"/>
+                <w:lang w:eastAsia="es-AR"/>
+                <w14:ligatures w14:val="none"/>
+              </w:rPr>
+              <w:t xml:space="preserve">: </w:t>
+            </w:r>
+            <w:proofErr w:type="spellStart"/>
+            <w:r>
+              <w:rPr>
+                <w:rFonts w:ascii="Times New Roman" w:eastAsia="Times New Roman" w:hAnsi="Times New Roman" w:cs="Times New Roman"/>
+                <w:color w:val="000000"/>
+                <w:kern w:val="0"/>
+                <w:sz w:val="20"/>
+                <w:szCs w:val="20"/>
+                <w:lang w:eastAsia="es-AR"/>
+                <w14:ligatures w14:val="none"/>
+              </w:rPr>
+              <w:t>int</w:t>
+            </w:r>
+            <w:proofErr w:type="spellEnd"/>
           </w:p>
           <w:p>
             <w:pPr>
@@ -339,17 +411,31 @@
                 <w14:ligatures w14:val="none"/>
               </w:rPr>
             </w:pPr>
-            <w:r>
-              <w:rPr>
-                <w:rFonts w:ascii="Times New Roman" w:eastAsia="Times New Roman" w:hAnsi="Times New Roman" w:cs="Times New Roman"/>
-                <w:color w:val="000000"/>
-                <w:kern w:val="0"/>
-                <w:sz w:val="20"/>
-                <w:szCs w:val="20"/>
-                <w:lang w:eastAsia="es-AR"/>
-                <w14:ligatures w14:val="none"/>
-              </w:rPr>
-              <w:t>fechaDeNacimiento: date</w:t>
+            <w:proofErr w:type="spellStart"/>
+            <w:r>
+              <w:rPr>
+                <w:rFonts w:ascii="Times New Roman" w:eastAsia="Times New Roman" w:hAnsi="Times New Roman" w:cs="Times New Roman"/>
+                <w:color w:val="000000"/>
+                <w:kern w:val="0"/>
+                <w:sz w:val="20"/>
+                <w:szCs w:val="20"/>
+                <w:lang w:eastAsia="es-AR"/>
+                <w14:ligatures w14:val="none"/>
+              </w:rPr>
+              <w:t>fechaDeNacimiento</w:t>
+            </w:r>
+            <w:proofErr w:type="spellEnd"/>
+            <w:r>
+              <w:rPr>
+                <w:rFonts w:ascii="Times New Roman" w:eastAsia="Times New Roman" w:hAnsi="Times New Roman" w:cs="Times New Roman"/>
+                <w:color w:val="000000"/>
+                <w:kern w:val="0"/>
+                <w:sz w:val="20"/>
+                <w:szCs w:val="20"/>
+                <w:lang w:eastAsia="es-AR"/>
+                <w14:ligatures w14:val="none"/>
+              </w:rPr>
+              <w:t>: date</w:t>
             </w:r>
           </w:p>
           <w:p>
@@ -366,17 +452,31 @@
                 <w14:ligatures w14:val="none"/>
               </w:rPr>
             </w:pPr>
-            <w:r>
-              <w:rPr>
-                <w:rFonts w:ascii="Times New Roman" w:eastAsia="Times New Roman" w:hAnsi="Times New Roman" w:cs="Times New Roman"/>
-                <w:color w:val="000000"/>
-                <w:kern w:val="0"/>
-                <w:sz w:val="20"/>
-                <w:szCs w:val="20"/>
-                <w:lang w:eastAsia="es-AR"/>
-                <w14:ligatures w14:val="none"/>
-              </w:rPr>
-              <w:t>telefonoConctacto:int </w:t>
+            <w:proofErr w:type="spellStart"/>
+            <w:r>
+              <w:rPr>
+                <w:rFonts w:ascii="Times New Roman" w:eastAsia="Times New Roman" w:hAnsi="Times New Roman" w:cs="Times New Roman"/>
+                <w:color w:val="000000"/>
+                <w:kern w:val="0"/>
+                <w:sz w:val="20"/>
+                <w:szCs w:val="20"/>
+                <w:lang w:eastAsia="es-AR"/>
+                <w14:ligatures w14:val="none"/>
+              </w:rPr>
+              <w:t>telefonoConctacto:int</w:t>
+            </w:r>
+            <w:proofErr w:type="spellEnd"/>
+            <w:r>
+              <w:rPr>
+                <w:rFonts w:ascii="Times New Roman" w:eastAsia="Times New Roman" w:hAnsi="Times New Roman" w:cs="Times New Roman"/>
+                <w:color w:val="000000"/>
+                <w:kern w:val="0"/>
+                <w:sz w:val="20"/>
+                <w:szCs w:val="20"/>
+                <w:lang w:eastAsia="es-AR"/>
+                <w14:ligatures w14:val="none"/>
+              </w:rPr>
+              <w:t> </w:t>
             </w:r>
           </w:p>
           <w:p>
@@ -390,6 +490,8 @@
                 <w14:ligatures w14:val="none"/>
               </w:rPr>
             </w:pPr>
+            <w:proofErr w:type="spellStart"/>
+            <w:proofErr w:type="gramStart"/>
             <w:r>
               <w:rPr>
                 <w:rFonts w:ascii="Times New Roman" w:eastAsia="Times New Roman" w:hAnsi="Times New Roman" w:cs="Times New Roman"/>
@@ -408,6 +510,8 @@
               </w:rPr>
               <w:t>boolean</w:t>
             </w:r>
+            <w:proofErr w:type="spellEnd"/>
+            <w:proofErr w:type="gramEnd"/>
           </w:p>
         </w:tc>
       </w:tr>
@@ -452,17 +556,31 @@
               </w:rPr>
               <w:t xml:space="preserve">+ </w:t>
             </w:r>
-            <w:r>
-              <w:rPr>
-                <w:rFonts w:ascii="Times New Roman" w:eastAsia="Times New Roman" w:hAnsi="Times New Roman" w:cs="Times New Roman"/>
-                <w:color w:val="000000"/>
-                <w:kern w:val="0"/>
-                <w:sz w:val="20"/>
-                <w:szCs w:val="20"/>
-                <w:lang w:eastAsia="es-AR"/>
-                <w14:ligatures w14:val="none"/>
-              </w:rPr>
-              <w:t>activar()</w:t>
+            <w:proofErr w:type="gramStart"/>
+            <w:r>
+              <w:rPr>
+                <w:rFonts w:ascii="Times New Roman" w:eastAsia="Times New Roman" w:hAnsi="Times New Roman" w:cs="Times New Roman"/>
+                <w:color w:val="000000"/>
+                <w:kern w:val="0"/>
+                <w:sz w:val="20"/>
+                <w:szCs w:val="20"/>
+                <w:lang w:eastAsia="es-AR"/>
+                <w14:ligatures w14:val="none"/>
+              </w:rPr>
+              <w:t>activar(</w:t>
+            </w:r>
+            <w:proofErr w:type="gramEnd"/>
+            <w:r>
+              <w:rPr>
+                <w:rFonts w:ascii="Times New Roman" w:eastAsia="Times New Roman" w:hAnsi="Times New Roman" w:cs="Times New Roman"/>
+                <w:color w:val="000000"/>
+                <w:kern w:val="0"/>
+                <w:sz w:val="20"/>
+                <w:szCs w:val="20"/>
+                <w:lang w:eastAsia="es-AR"/>
+                <w14:ligatures w14:val="none"/>
+              </w:rPr>
+              <w:t>)</w:t>
             </w:r>
           </w:p>
           <w:p>
@@ -489,7 +607,47 @@
                 <w:lang w:eastAsia="es-AR"/>
                 <w14:ligatures w14:val="none"/>
               </w:rPr>
-              <w:t>+ darDeBaja()</w:t>
+              <w:t xml:space="preserve">+ </w:t>
+            </w:r>
+            <w:proofErr w:type="spellStart"/>
+            <w:proofErr w:type="gramStart"/>
+            <w:r>
+              <w:rPr>
+                <w:rFonts w:ascii="Times New Roman" w:eastAsia="Times New Roman" w:hAnsi="Times New Roman" w:cs="Times New Roman"/>
+                <w:color w:val="000000"/>
+                <w:kern w:val="0"/>
+                <w:sz w:val="20"/>
+                <w:szCs w:val="20"/>
+                <w:lang w:eastAsia="es-AR"/>
+                <w14:ligatures w14:val="none"/>
+              </w:rPr>
+              <w:t>darDeBaja</w:t>
+            </w:r>
+            <w:proofErr w:type="spellEnd"/>
+            <w:r>
+              <w:rPr>
+                <w:rFonts w:ascii="Times New Roman" w:eastAsia="Times New Roman" w:hAnsi="Times New Roman" w:cs="Times New Roman"/>
+                <w:color w:val="000000"/>
+                <w:kern w:val="0"/>
+                <w:sz w:val="20"/>
+                <w:szCs w:val="20"/>
+                <w:lang w:eastAsia="es-AR"/>
+                <w14:ligatures w14:val="none"/>
+              </w:rPr>
+              <w:t>(</w:t>
+            </w:r>
+            <w:proofErr w:type="gramEnd"/>
+            <w:r>
+              <w:rPr>
+                <w:rFonts w:ascii="Times New Roman" w:eastAsia="Times New Roman" w:hAnsi="Times New Roman" w:cs="Times New Roman"/>
+                <w:color w:val="000000"/>
+                <w:kern w:val="0"/>
+                <w:sz w:val="20"/>
+                <w:szCs w:val="20"/>
+                <w:lang w:eastAsia="es-AR"/>
+                <w14:ligatures w14:val="none"/>
+              </w:rPr>
+              <w:t>)</w:t>
             </w:r>
           </w:p>
           <w:p>
@@ -516,7 +674,47 @@
                 <w:lang w:eastAsia="es-AR"/>
                 <w14:ligatures w14:val="none"/>
               </w:rPr>
-              <w:t>+ modificarDatos()</w:t>
+              <w:t xml:space="preserve">+ </w:t>
+            </w:r>
+            <w:proofErr w:type="spellStart"/>
+            <w:proofErr w:type="gramStart"/>
+            <w:r>
+              <w:rPr>
+                <w:rFonts w:ascii="Times New Roman" w:eastAsia="Times New Roman" w:hAnsi="Times New Roman" w:cs="Times New Roman"/>
+                <w:color w:val="000000"/>
+                <w:kern w:val="0"/>
+                <w:sz w:val="20"/>
+                <w:szCs w:val="20"/>
+                <w:lang w:eastAsia="es-AR"/>
+                <w14:ligatures w14:val="none"/>
+              </w:rPr>
+              <w:t>modificarDatos</w:t>
+            </w:r>
+            <w:proofErr w:type="spellEnd"/>
+            <w:r>
+              <w:rPr>
+                <w:rFonts w:ascii="Times New Roman" w:eastAsia="Times New Roman" w:hAnsi="Times New Roman" w:cs="Times New Roman"/>
+                <w:color w:val="000000"/>
+                <w:kern w:val="0"/>
+                <w:sz w:val="20"/>
+                <w:szCs w:val="20"/>
+                <w:lang w:eastAsia="es-AR"/>
+                <w14:ligatures w14:val="none"/>
+              </w:rPr>
+              <w:t>(</w:t>
+            </w:r>
+            <w:proofErr w:type="gramEnd"/>
+            <w:r>
+              <w:rPr>
+                <w:rFonts w:ascii="Times New Roman" w:eastAsia="Times New Roman" w:hAnsi="Times New Roman" w:cs="Times New Roman"/>
+                <w:color w:val="000000"/>
+                <w:kern w:val="0"/>
+                <w:sz w:val="20"/>
+                <w:szCs w:val="20"/>
+                <w:lang w:eastAsia="es-AR"/>
+                <w14:ligatures w14:val="none"/>
+              </w:rPr>
+              <w:t>)</w:t>
             </w:r>
           </w:p>
         </w:tc>
@@ -643,6 +841,8 @@
                 <w14:ligatures w14:val="none"/>
               </w:rPr>
             </w:pPr>
+            <w:proofErr w:type="spellStart"/>
+            <w:proofErr w:type="gramStart"/>
             <w:r>
               <w:rPr>
                 <w:rFonts w:ascii="Times New Roman" w:eastAsia="Times New Roman" w:hAnsi="Times New Roman" w:cs="Times New Roman"/>
@@ -655,6 +855,8 @@
               </w:rPr>
               <w:t>fechaInicio:date</w:t>
             </w:r>
+            <w:proofErr w:type="spellEnd"/>
+            <w:proofErr w:type="gramEnd"/>
           </w:p>
           <w:p>
             <w:pPr>
@@ -677,7 +879,33 @@
                 <w:lang w:eastAsia="es-AR"/>
                 <w14:ligatures w14:val="none"/>
               </w:rPr>
-              <w:t xml:space="preserve"> fechaFin: date </w:t>
+              <w:t xml:space="preserve"> </w:t>
+            </w:r>
+            <w:proofErr w:type="spellStart"/>
+            <w:r>
+              <w:rPr>
+                <w:rFonts w:ascii="Times New Roman" w:eastAsia="Times New Roman" w:hAnsi="Times New Roman" w:cs="Times New Roman"/>
+                <w:color w:val="000000"/>
+                <w:kern w:val="0"/>
+                <w:sz w:val="20"/>
+                <w:szCs w:val="20"/>
+                <w:lang w:eastAsia="es-AR"/>
+                <w14:ligatures w14:val="none"/>
+              </w:rPr>
+              <w:t>fechaFin</w:t>
+            </w:r>
+            <w:proofErr w:type="spellEnd"/>
+            <w:r>
+              <w:rPr>
+                <w:rFonts w:ascii="Times New Roman" w:eastAsia="Times New Roman" w:hAnsi="Times New Roman" w:cs="Times New Roman"/>
+                <w:color w:val="000000"/>
+                <w:kern w:val="0"/>
+                <w:sz w:val="20"/>
+                <w:szCs w:val="20"/>
+                <w:lang w:eastAsia="es-AR"/>
+                <w14:ligatures w14:val="none"/>
+              </w:rPr>
+              <w:t>: date </w:t>
             </w:r>
           </w:p>
           <w:p>
@@ -694,18 +922,46 @@
                 <w14:ligatures w14:val="none"/>
               </w:rPr>
             </w:pPr>
-            <w:r>
-              <w:rPr>
-                <w:rFonts w:ascii="Times New Roman" w:eastAsia="Times New Roman" w:hAnsi="Times New Roman" w:cs="Times New Roman"/>
-                <w:color w:val="000000"/>
-                <w:kern w:val="0"/>
-                <w:sz w:val="20"/>
-                <w:szCs w:val="20"/>
-                <w:lang w:eastAsia="es-AR"/>
-                <w14:ligatures w14:val="none"/>
-              </w:rPr>
-              <w:t>precioU: double</w:t>
-            </w:r>
+            <w:proofErr w:type="spellStart"/>
+            <w:r>
+              <w:rPr>
+                <w:rFonts w:ascii="Times New Roman" w:eastAsia="Times New Roman" w:hAnsi="Times New Roman" w:cs="Times New Roman"/>
+                <w:color w:val="000000"/>
+                <w:kern w:val="0"/>
+                <w:sz w:val="20"/>
+                <w:szCs w:val="20"/>
+                <w:lang w:eastAsia="es-AR"/>
+                <w14:ligatures w14:val="none"/>
+              </w:rPr>
+              <w:t>precioU</w:t>
+            </w:r>
+            <w:proofErr w:type="spellEnd"/>
+            <w:r>
+              <w:rPr>
+                <w:rFonts w:ascii="Times New Roman" w:eastAsia="Times New Roman" w:hAnsi="Times New Roman" w:cs="Times New Roman"/>
+                <w:color w:val="000000"/>
+                <w:kern w:val="0"/>
+                <w:sz w:val="20"/>
+                <w:szCs w:val="20"/>
+                <w:lang w:eastAsia="es-AR"/>
+                <w14:ligatures w14:val="none"/>
+              </w:rPr>
+              <w:t xml:space="preserve">: </w:t>
+            </w:r>
+            <w:proofErr w:type="spellStart"/>
+            <w:r>
+              <w:rPr>
+                <w:rFonts w:ascii="Times New Roman" w:eastAsia="Times New Roman" w:hAnsi="Times New Roman" w:cs="Times New Roman"/>
+                <w:color w:val="000000"/>
+                <w:kern w:val="0"/>
+                <w:sz w:val="20"/>
+                <w:szCs w:val="20"/>
+                <w:lang w:eastAsia="es-AR"/>
+                <w14:ligatures w14:val="none"/>
+              </w:rPr>
+              <w:t>double</w:t>
+            </w:r>
+            <w:proofErr w:type="spellEnd"/>
           </w:p>
           <w:p>
             <w:pPr>
@@ -718,6 +974,7 @@
                 <w14:ligatures w14:val="none"/>
               </w:rPr>
             </w:pPr>
+            <w:proofErr w:type="spellStart"/>
             <w:r>
               <w:rPr>
                 <w:rFonts w:ascii="Times New Roman" w:eastAsia="Times New Roman" w:hAnsi="Times New Roman" w:cs="Times New Roman"/>
@@ -730,6 +987,7 @@
               </w:rPr>
               <w:t>frecuencia:int</w:t>
             </w:r>
+            <w:proofErr w:type="spellEnd"/>
           </w:p>
         </w:tc>
       </w:tr>
@@ -759,6 +1017,8 @@
                 <w14:ligatures w14:val="none"/>
               </w:rPr>
             </w:pPr>
+            <w:proofErr w:type="spellStart"/>
+            <w:proofErr w:type="gramStart"/>
             <w:r>
               <w:rPr>
                 <w:rFonts w:ascii="Times New Roman" w:eastAsia="Times New Roman" w:hAnsi="Times New Roman" w:cs="Times New Roman"/>
@@ -769,7 +1029,33 @@
                 <w:lang w:eastAsia="es-AR"/>
                 <w14:ligatures w14:val="none"/>
               </w:rPr>
-              <w:t>calcularPrecio()</w:t>
+              <w:t>calcularPrecio</w:t>
+            </w:r>
+            <w:proofErr w:type="spellEnd"/>
+            <w:r>
+              <w:rPr>
+                <w:rFonts w:ascii="Times New Roman" w:eastAsia="Times New Roman" w:hAnsi="Times New Roman" w:cs="Times New Roman"/>
+                <w:color w:val="000000"/>
+                <w:kern w:val="0"/>
+                <w:sz w:val="22"/>
+                <w:szCs w:val="22"/>
+                <w:lang w:eastAsia="es-AR"/>
+                <w14:ligatures w14:val="none"/>
+              </w:rPr>
+              <w:t>(</w:t>
+            </w:r>
+            <w:proofErr w:type="gramEnd"/>
+            <w:r>
+              <w:rPr>
+                <w:rFonts w:ascii="Times New Roman" w:eastAsia="Times New Roman" w:hAnsi="Times New Roman" w:cs="Times New Roman"/>
+                <w:color w:val="000000"/>
+                <w:kern w:val="0"/>
+                <w:sz w:val="22"/>
+                <w:szCs w:val="22"/>
+                <w:lang w:eastAsia="es-AR"/>
+                <w14:ligatures w14:val="none"/>
+              </w:rPr>
+              <w:t>)</w:t>
             </w:r>
           </w:p>
         </w:tc>
@@ -896,17 +1182,33 @@
                 <w14:ligatures w14:val="none"/>
               </w:rPr>
             </w:pPr>
-            <w:r>
-              <w:rPr>
-                <w:rFonts w:ascii="Times New Roman" w:eastAsia="Times New Roman" w:hAnsi="Times New Roman" w:cs="Times New Roman"/>
-                <w:color w:val="000000"/>
-                <w:kern w:val="0"/>
-                <w:sz w:val="20"/>
-                <w:szCs w:val="20"/>
-                <w:lang w:eastAsia="es-AR"/>
-                <w14:ligatures w14:val="none"/>
-              </w:rPr>
-              <w:t xml:space="preserve">nombre:String </w:t>
+            <w:proofErr w:type="spellStart"/>
+            <w:proofErr w:type="gramStart"/>
+            <w:r>
+              <w:rPr>
+                <w:rFonts w:ascii="Times New Roman" w:eastAsia="Times New Roman" w:hAnsi="Times New Roman" w:cs="Times New Roman"/>
+                <w:color w:val="000000"/>
+                <w:kern w:val="0"/>
+                <w:sz w:val="20"/>
+                <w:szCs w:val="20"/>
+                <w:lang w:eastAsia="es-AR"/>
+                <w14:ligatures w14:val="none"/>
+              </w:rPr>
+              <w:t>nombre:String</w:t>
+            </w:r>
+            <w:proofErr w:type="spellEnd"/>
+            <w:proofErr w:type="gramEnd"/>
+            <w:r>
+              <w:rPr>
+                <w:rFonts w:ascii="Times New Roman" w:eastAsia="Times New Roman" w:hAnsi="Times New Roman" w:cs="Times New Roman"/>
+                <w:color w:val="000000"/>
+                <w:kern w:val="0"/>
+                <w:sz w:val="20"/>
+                <w:szCs w:val="20"/>
+                <w:lang w:eastAsia="es-AR"/>
+                <w14:ligatures w14:val="none"/>
+              </w:rPr>
+              <w:t xml:space="preserve"> </w:t>
             </w:r>
           </w:p>
           <w:p>
@@ -920,18 +1222,46 @@
                 <w14:ligatures w14:val="none"/>
               </w:rPr>
             </w:pPr>
-            <w:r>
-              <w:rPr>
-                <w:rFonts w:ascii="Times New Roman" w:eastAsia="Times New Roman" w:hAnsi="Times New Roman" w:cs="Times New Roman"/>
-                <w:color w:val="000000"/>
-                <w:kern w:val="0"/>
-                <w:sz w:val="20"/>
-                <w:szCs w:val="20"/>
-                <w:lang w:eastAsia="es-AR"/>
-                <w14:ligatures w14:val="none"/>
-              </w:rPr>
-              <w:t>dni: int</w:t>
-            </w:r>
+            <w:proofErr w:type="spellStart"/>
+            <w:r>
+              <w:rPr>
+                <w:rFonts w:ascii="Times New Roman" w:eastAsia="Times New Roman" w:hAnsi="Times New Roman" w:cs="Times New Roman"/>
+                <w:color w:val="000000"/>
+                <w:kern w:val="0"/>
+                <w:sz w:val="20"/>
+                <w:szCs w:val="20"/>
+                <w:lang w:eastAsia="es-AR"/>
+                <w14:ligatures w14:val="none"/>
+              </w:rPr>
+              <w:t>dni</w:t>
+            </w:r>
+            <w:proofErr w:type="spellEnd"/>
+            <w:r>
+              <w:rPr>
+                <w:rFonts w:ascii="Times New Roman" w:eastAsia="Times New Roman" w:hAnsi="Times New Roman" w:cs="Times New Roman"/>
+                <w:color w:val="000000"/>
+                <w:kern w:val="0"/>
+                <w:sz w:val="20"/>
+                <w:szCs w:val="20"/>
+                <w:lang w:eastAsia="es-AR"/>
+                <w14:ligatures w14:val="none"/>
+              </w:rPr>
+              <w:t xml:space="preserve">: </w:t>
+            </w:r>
+            <w:proofErr w:type="spellStart"/>
+            <w:r>
+              <w:rPr>
+                <w:rFonts w:ascii="Times New Roman" w:eastAsia="Times New Roman" w:hAnsi="Times New Roman" w:cs="Times New Roman"/>
+                <w:color w:val="000000"/>
+                <w:kern w:val="0"/>
+                <w:sz w:val="20"/>
+                <w:szCs w:val="20"/>
+                <w:lang w:eastAsia="es-AR"/>
+                <w14:ligatures w14:val="none"/>
+              </w:rPr>
+              <w:t>int</w:t>
+            </w:r>
+            <w:proofErr w:type="spellEnd"/>
           </w:p>
           <w:p>
             <w:pPr>
@@ -944,18 +1274,46 @@
                 <w14:ligatures w14:val="none"/>
               </w:rPr>
             </w:pPr>
-            <w:r>
-              <w:rPr>
-                <w:rFonts w:ascii="Times New Roman" w:eastAsia="Times New Roman" w:hAnsi="Times New Roman" w:cs="Times New Roman"/>
-                <w:color w:val="000000"/>
-                <w:kern w:val="0"/>
-                <w:sz w:val="20"/>
-                <w:szCs w:val="20"/>
-                <w:lang w:eastAsia="es-AR"/>
-                <w14:ligatures w14:val="none"/>
-              </w:rPr>
-              <w:t>telefono: int</w:t>
-            </w:r>
+            <w:proofErr w:type="spellStart"/>
+            <w:r>
+              <w:rPr>
+                <w:rFonts w:ascii="Times New Roman" w:eastAsia="Times New Roman" w:hAnsi="Times New Roman" w:cs="Times New Roman"/>
+                <w:color w:val="000000"/>
+                <w:kern w:val="0"/>
+                <w:sz w:val="20"/>
+                <w:szCs w:val="20"/>
+                <w:lang w:eastAsia="es-AR"/>
+                <w14:ligatures w14:val="none"/>
+              </w:rPr>
+              <w:t>telefono</w:t>
+            </w:r>
+            <w:proofErr w:type="spellEnd"/>
+            <w:r>
+              <w:rPr>
+                <w:rFonts w:ascii="Times New Roman" w:eastAsia="Times New Roman" w:hAnsi="Times New Roman" w:cs="Times New Roman"/>
+                <w:color w:val="000000"/>
+                <w:kern w:val="0"/>
+                <w:sz w:val="20"/>
+                <w:szCs w:val="20"/>
+                <w:lang w:eastAsia="es-AR"/>
+                <w14:ligatures w14:val="none"/>
+              </w:rPr>
+              <w:t xml:space="preserve">: </w:t>
+            </w:r>
+            <w:proofErr w:type="spellStart"/>
+            <w:r>
+              <w:rPr>
+                <w:rFonts w:ascii="Times New Roman" w:eastAsia="Times New Roman" w:hAnsi="Times New Roman" w:cs="Times New Roman"/>
+                <w:color w:val="000000"/>
+                <w:kern w:val="0"/>
+                <w:sz w:val="20"/>
+                <w:szCs w:val="20"/>
+                <w:lang w:eastAsia="es-AR"/>
+                <w14:ligatures w14:val="none"/>
+              </w:rPr>
+              <w:t>int</w:t>
+            </w:r>
+            <w:proofErr w:type="spellEnd"/>
           </w:p>
         </w:tc>
       </w:tr>
@@ -987,17 +1345,45 @@
                 <w14:ligatures w14:val="none"/>
               </w:rPr>
             </w:pPr>
-            <w:r>
-              <w:rPr>
-                <w:rFonts w:ascii="Times New Roman" w:eastAsia="Times New Roman" w:hAnsi="Times New Roman" w:cs="Times New Roman"/>
-                <w:color w:val="000000"/>
-                <w:kern w:val="0"/>
-                <w:sz w:val="20"/>
-                <w:szCs w:val="20"/>
-                <w:lang w:eastAsia="es-AR"/>
-                <w14:ligatures w14:val="none"/>
-              </w:rPr>
-              <w:t>modificarDatos()</w:t>
+            <w:proofErr w:type="spellStart"/>
+            <w:proofErr w:type="gramStart"/>
+            <w:r>
+              <w:rPr>
+                <w:rFonts w:ascii="Times New Roman" w:eastAsia="Times New Roman" w:hAnsi="Times New Roman" w:cs="Times New Roman"/>
+                <w:color w:val="000000"/>
+                <w:kern w:val="0"/>
+                <w:sz w:val="20"/>
+                <w:szCs w:val="20"/>
+                <w:lang w:eastAsia="es-AR"/>
+                <w14:ligatures w14:val="none"/>
+              </w:rPr>
+              <w:t>modificarDatos</w:t>
+            </w:r>
+            <w:proofErr w:type="spellEnd"/>
+            <w:r>
+              <w:rPr>
+                <w:rFonts w:ascii="Times New Roman" w:eastAsia="Times New Roman" w:hAnsi="Times New Roman" w:cs="Times New Roman"/>
+                <w:color w:val="000000"/>
+                <w:kern w:val="0"/>
+                <w:sz w:val="20"/>
+                <w:szCs w:val="20"/>
+                <w:lang w:eastAsia="es-AR"/>
+                <w14:ligatures w14:val="none"/>
+              </w:rPr>
+              <w:t>(</w:t>
+            </w:r>
+            <w:proofErr w:type="gramEnd"/>
+            <w:r>
+              <w:rPr>
+                <w:rFonts w:ascii="Times New Roman" w:eastAsia="Times New Roman" w:hAnsi="Times New Roman" w:cs="Times New Roman"/>
+                <w:color w:val="000000"/>
+                <w:kern w:val="0"/>
+                <w:sz w:val="20"/>
+                <w:szCs w:val="20"/>
+                <w:lang w:eastAsia="es-AR"/>
+                <w14:ligatures w14:val="none"/>
+              </w:rPr>
+              <w:t>)</w:t>
             </w:r>
           </w:p>
         </w:tc>
@@ -1056,6 +1442,7 @@
                 <w14:ligatures w14:val="none"/>
               </w:rPr>
             </w:pPr>
+            <w:proofErr w:type="spellStart"/>
             <w:r>
               <w:rPr>
                 <w:rFonts w:ascii="Times New Roman" w:eastAsia="Times New Roman" w:hAnsi="Times New Roman" w:cs="Times New Roman"/>
@@ -1069,6 +1456,7 @@
               <w:lastRenderedPageBreak/>
               <w:t>Inscripcion</w:t>
             </w:r>
+            <w:proofErr w:type="spellEnd"/>
           </w:p>
         </w:tc>
       </w:tr>
@@ -1146,6 +1534,7 @@
                 <w14:ligatures w14:val="none"/>
               </w:rPr>
             </w:pPr>
+            <w:proofErr w:type="spellStart"/>
             <w:r>
               <w:rPr>
                 <w:rFonts w:ascii="Times New Roman" w:eastAsia="Times New Roman" w:hAnsi="Times New Roman" w:cs="Times New Roman"/>
@@ -1170,6 +1559,7 @@
               </w:rPr>
               <w:t>Inicio</w:t>
             </w:r>
+            <w:proofErr w:type="spellEnd"/>
             <w:r>
               <w:rPr>
                 <w:rFonts w:ascii="Times New Roman" w:eastAsia="Times New Roman" w:hAnsi="Times New Roman" w:cs="Times New Roman"/>
@@ -1204,8 +1594,22 @@
                 <w:lang w:eastAsia="es-AR"/>
                 <w14:ligatures w14:val="none"/>
               </w:rPr>
-              <w:t>descuento: float</w:t>
-            </w:r>
+              <w:t xml:space="preserve">descuento: </w:t>
+            </w:r>
+            <w:proofErr w:type="spellStart"/>
+            <w:r>
+              <w:rPr>
+                <w:rFonts w:ascii="Times New Roman" w:eastAsia="Times New Roman" w:hAnsi="Times New Roman" w:cs="Times New Roman"/>
+                <w:color w:val="000000"/>
+                <w:kern w:val="0"/>
+                <w:sz w:val="20"/>
+                <w:szCs w:val="20"/>
+                <w:lang w:eastAsia="es-AR"/>
+                <w14:ligatures w14:val="none"/>
+              </w:rPr>
+              <w:t>float</w:t>
+            </w:r>
+            <w:proofErr w:type="spellEnd"/>
           </w:p>
           <w:p>
             <w:pPr>
@@ -1218,6 +1622,8 @@
                 <w14:ligatures w14:val="none"/>
               </w:rPr>
             </w:pPr>
+            <w:proofErr w:type="spellStart"/>
+            <w:proofErr w:type="gramStart"/>
             <w:r>
               <w:rPr>
                 <w:rFonts w:ascii="Times New Roman" w:eastAsia="Times New Roman" w:hAnsi="Times New Roman" w:cs="Times New Roman"/>
@@ -1227,6 +1633,8 @@
               </w:rPr>
               <w:t>fechaFin:date</w:t>
             </w:r>
+            <w:proofErr w:type="spellEnd"/>
+            <w:proofErr w:type="gramEnd"/>
           </w:p>
         </w:tc>
       </w:tr>
@@ -1270,17 +1678,45 @@
               </w:rPr>
               <w:t>+</w:t>
             </w:r>
-            <w:r>
-              <w:rPr>
-                <w:rFonts w:ascii="Times New Roman" w:eastAsia="Times New Roman" w:hAnsi="Times New Roman" w:cs="Times New Roman"/>
-                <w:color w:val="000000"/>
-                <w:kern w:val="0"/>
-                <w:sz w:val="20"/>
-                <w:szCs w:val="20"/>
-                <w:lang w:eastAsia="es-AR"/>
-                <w14:ligatures w14:val="none"/>
-              </w:rPr>
-              <w:t>calcularDescuento()</w:t>
+            <w:proofErr w:type="spellStart"/>
+            <w:proofErr w:type="gramStart"/>
+            <w:r>
+              <w:rPr>
+                <w:rFonts w:ascii="Times New Roman" w:eastAsia="Times New Roman" w:hAnsi="Times New Roman" w:cs="Times New Roman"/>
+                <w:color w:val="000000"/>
+                <w:kern w:val="0"/>
+                <w:sz w:val="20"/>
+                <w:szCs w:val="20"/>
+                <w:lang w:eastAsia="es-AR"/>
+                <w14:ligatures w14:val="none"/>
+              </w:rPr>
+              <w:t>calcularDescuento</w:t>
+            </w:r>
+            <w:proofErr w:type="spellEnd"/>
+            <w:r>
+              <w:rPr>
+                <w:rFonts w:ascii="Times New Roman" w:eastAsia="Times New Roman" w:hAnsi="Times New Roman" w:cs="Times New Roman"/>
+                <w:color w:val="000000"/>
+                <w:kern w:val="0"/>
+                <w:sz w:val="20"/>
+                <w:szCs w:val="20"/>
+                <w:lang w:eastAsia="es-AR"/>
+                <w14:ligatures w14:val="none"/>
+              </w:rPr>
+              <w:t>(</w:t>
+            </w:r>
+            <w:proofErr w:type="gramEnd"/>
+            <w:r>
+              <w:rPr>
+                <w:rFonts w:ascii="Times New Roman" w:eastAsia="Times New Roman" w:hAnsi="Times New Roman" w:cs="Times New Roman"/>
+                <w:color w:val="000000"/>
+                <w:kern w:val="0"/>
+                <w:sz w:val="20"/>
+                <w:szCs w:val="20"/>
+                <w:lang w:eastAsia="es-AR"/>
+                <w14:ligatures w14:val="none"/>
+              </w:rPr>
+              <w:t>)</w:t>
             </w:r>
           </w:p>
           <w:p>
@@ -1306,7 +1742,47 @@
                 <w:lang w:eastAsia="es-AR"/>
                 <w14:ligatures w14:val="none"/>
               </w:rPr>
-              <w:t>+ calcularPrecioFinal()</w:t>
+              <w:t xml:space="preserve">+ </w:t>
+            </w:r>
+            <w:proofErr w:type="spellStart"/>
+            <w:proofErr w:type="gramStart"/>
+            <w:r>
+              <w:rPr>
+                <w:rFonts w:ascii="Times New Roman" w:eastAsia="Times New Roman" w:hAnsi="Times New Roman" w:cs="Times New Roman"/>
+                <w:color w:val="000000"/>
+                <w:kern w:val="0"/>
+                <w:sz w:val="20"/>
+                <w:szCs w:val="20"/>
+                <w:lang w:eastAsia="es-AR"/>
+                <w14:ligatures w14:val="none"/>
+              </w:rPr>
+              <w:t>calcularPrecioFinal</w:t>
+            </w:r>
+            <w:proofErr w:type="spellEnd"/>
+            <w:r>
+              <w:rPr>
+                <w:rFonts w:ascii="Times New Roman" w:eastAsia="Times New Roman" w:hAnsi="Times New Roman" w:cs="Times New Roman"/>
+                <w:color w:val="000000"/>
+                <w:kern w:val="0"/>
+                <w:sz w:val="20"/>
+                <w:szCs w:val="20"/>
+                <w:lang w:eastAsia="es-AR"/>
+                <w14:ligatures w14:val="none"/>
+              </w:rPr>
+              <w:t>(</w:t>
+            </w:r>
+            <w:proofErr w:type="gramEnd"/>
+            <w:r>
+              <w:rPr>
+                <w:rFonts w:ascii="Times New Roman" w:eastAsia="Times New Roman" w:hAnsi="Times New Roman" w:cs="Times New Roman"/>
+                <w:color w:val="000000"/>
+                <w:kern w:val="0"/>
+                <w:sz w:val="20"/>
+                <w:szCs w:val="20"/>
+                <w:lang w:eastAsia="es-AR"/>
+                <w14:ligatures w14:val="none"/>
+              </w:rPr>
+              <w:t>)</w:t>
             </w:r>
           </w:p>
           <w:p>
@@ -1332,7 +1808,47 @@
                 <w:lang w:eastAsia="es-AR"/>
                 <w14:ligatures w14:val="none"/>
               </w:rPr>
-              <w:t>+ verificarVigencia()</w:t>
+              <w:t xml:space="preserve">+ </w:t>
+            </w:r>
+            <w:proofErr w:type="spellStart"/>
+            <w:proofErr w:type="gramStart"/>
+            <w:r>
+              <w:rPr>
+                <w:rFonts w:ascii="Times New Roman" w:eastAsia="Times New Roman" w:hAnsi="Times New Roman" w:cs="Times New Roman"/>
+                <w:color w:val="000000"/>
+                <w:kern w:val="0"/>
+                <w:sz w:val="20"/>
+                <w:szCs w:val="20"/>
+                <w:lang w:eastAsia="es-AR"/>
+                <w14:ligatures w14:val="none"/>
+              </w:rPr>
+              <w:t>verificarVigencia</w:t>
+            </w:r>
+            <w:proofErr w:type="spellEnd"/>
+            <w:r>
+              <w:rPr>
+                <w:rFonts w:ascii="Times New Roman" w:eastAsia="Times New Roman" w:hAnsi="Times New Roman" w:cs="Times New Roman"/>
+                <w:color w:val="000000"/>
+                <w:kern w:val="0"/>
+                <w:sz w:val="20"/>
+                <w:szCs w:val="20"/>
+                <w:lang w:eastAsia="es-AR"/>
+                <w14:ligatures w14:val="none"/>
+              </w:rPr>
+              <w:t>(</w:t>
+            </w:r>
+            <w:proofErr w:type="gramEnd"/>
+            <w:r>
+              <w:rPr>
+                <w:rFonts w:ascii="Times New Roman" w:eastAsia="Times New Roman" w:hAnsi="Times New Roman" w:cs="Times New Roman"/>
+                <w:color w:val="000000"/>
+                <w:kern w:val="0"/>
+                <w:sz w:val="20"/>
+                <w:szCs w:val="20"/>
+                <w:lang w:eastAsia="es-AR"/>
+                <w14:ligatures w14:val="none"/>
+              </w:rPr>
+              <w:t>)</w:t>
             </w:r>
           </w:p>
           <w:p>
@@ -1484,7 +2000,10 @@
               <w:ind w:left="107"/>
               <w:rPr>
                 <w:rFonts w:ascii="Times New Roman" w:eastAsia="Times New Roman" w:hAnsi="Times New Roman" w:cs="Times New Roman"/>
-                <w:kern w:val="0"/>
+                <w:color w:val="000000"/>
+                <w:kern w:val="0"/>
+                <w:sz w:val="20"/>
+                <w:szCs w:val="20"/>
                 <w:lang w:eastAsia="es-AR"/>
                 <w14:ligatures w14:val="none"/>
               </w:rPr>
@@ -1511,7 +2030,33 @@
                 <w:lang w:eastAsia="es-AR"/>
                 <w14:ligatures w14:val="none"/>
               </w:rPr>
-              <w:t>&lt;listaSocio&gt;</w:t>
+              <w:t>&lt;</w:t>
+            </w:r>
+            <w:proofErr w:type="spellStart"/>
+            <w:r>
+              <w:rPr>
+                <w:rFonts w:ascii="Times New Roman" w:eastAsia="Times New Roman" w:hAnsi="Times New Roman" w:cs="Times New Roman"/>
+                <w:color w:val="000000"/>
+                <w:kern w:val="0"/>
+                <w:sz w:val="20"/>
+                <w:szCs w:val="20"/>
+                <w:lang w:eastAsia="es-AR"/>
+                <w14:ligatures w14:val="none"/>
+              </w:rPr>
+              <w:t>listaSocio</w:t>
+            </w:r>
+            <w:proofErr w:type="spellEnd"/>
+            <w:r>
+              <w:rPr>
+                <w:rFonts w:ascii="Times New Roman" w:eastAsia="Times New Roman" w:hAnsi="Times New Roman" w:cs="Times New Roman"/>
+                <w:color w:val="000000"/>
+                <w:kern w:val="0"/>
+                <w:sz w:val="20"/>
+                <w:szCs w:val="20"/>
+                <w:lang w:eastAsia="es-AR"/>
+                <w14:ligatures w14:val="none"/>
+              </w:rPr>
+              <w:t>&gt;</w:t>
             </w:r>
           </w:p>
           <w:p>
@@ -1535,7 +2080,33 @@
                 <w:lang w:eastAsia="es-AR"/>
                 <w14:ligatures w14:val="none"/>
               </w:rPr>
-              <w:t>horario: time</w:t>
+              <w:t>asistente: &lt;</w:t>
+            </w:r>
+            <w:proofErr w:type="spellStart"/>
+            <w:r>
+              <w:rPr>
+                <w:rFonts w:ascii="Times New Roman" w:eastAsia="Times New Roman" w:hAnsi="Times New Roman" w:cs="Times New Roman"/>
+                <w:color w:val="000000"/>
+                <w:kern w:val="0"/>
+                <w:sz w:val="20"/>
+                <w:szCs w:val="20"/>
+                <w:lang w:eastAsia="es-AR"/>
+                <w14:ligatures w14:val="none"/>
+              </w:rPr>
+              <w:t>listoSocio</w:t>
+            </w:r>
+            <w:proofErr w:type="spellEnd"/>
+            <w:r>
+              <w:rPr>
+                <w:rFonts w:ascii="Times New Roman" w:eastAsia="Times New Roman" w:hAnsi="Times New Roman" w:cs="Times New Roman"/>
+                <w:color w:val="000000"/>
+                <w:kern w:val="0"/>
+                <w:sz w:val="20"/>
+                <w:szCs w:val="20"/>
+                <w:lang w:eastAsia="es-AR"/>
+                <w14:ligatures w14:val="none"/>
+              </w:rPr>
+              <w:t>&gt;</w:t>
             </w:r>
           </w:p>
           <w:p>
@@ -1559,19 +2130,7 @@
                 <w:lang w:eastAsia="es-AR"/>
                 <w14:ligatures w14:val="none"/>
               </w:rPr>
-              <w:t xml:space="preserve">estado: </w:t>
-            </w:r>
-            <w:r>
-              <w:rPr>
-                <w:rFonts w:ascii="Times New Roman" w:eastAsia="Times New Roman" w:hAnsi="Times New Roman" w:cs="Times New Roman"/>
-                <w:color w:val="000000"/>
-                <w:kern w:val="0"/>
-                <w:sz w:val="20"/>
-                <w:szCs w:val="20"/>
-                <w:lang w:eastAsia="es-AR"/>
-                <w14:ligatures w14:val="none"/>
-              </w:rPr>
-              <w:t>String</w:t>
+              <w:t>horario: time</w:t>
             </w:r>
           </w:p>
           <w:p>
@@ -1595,8 +2154,72 @@
                 <w:lang w:eastAsia="es-AR"/>
                 <w14:ligatures w14:val="none"/>
               </w:rPr>
-              <w:t>cupoMaximo: int</w:t>
-            </w:r>
+              <w:t xml:space="preserve">estado: </w:t>
+            </w:r>
+            <w:r>
+              <w:rPr>
+                <w:rFonts w:ascii="Times New Roman" w:eastAsia="Times New Roman" w:hAnsi="Times New Roman" w:cs="Times New Roman"/>
+                <w:color w:val="000000"/>
+                <w:kern w:val="0"/>
+                <w:sz w:val="20"/>
+                <w:szCs w:val="20"/>
+                <w:lang w:eastAsia="es-AR"/>
+                <w14:ligatures w14:val="none"/>
+              </w:rPr>
+              <w:t>String</w:t>
+            </w:r>
+          </w:p>
+          <w:p>
+            <w:pPr>
+              <w:spacing w:after="0" w:line="240" w:lineRule="auto"/>
+              <w:ind w:left="107"/>
+              <w:rPr>
+                <w:rFonts w:ascii="Times New Roman" w:eastAsia="Times New Roman" w:hAnsi="Times New Roman" w:cs="Times New Roman"/>
+                <w:kern w:val="0"/>
+                <w:lang w:eastAsia="es-AR"/>
+                <w14:ligatures w14:val="none"/>
+              </w:rPr>
+            </w:pPr>
+            <w:proofErr w:type="spellStart"/>
+            <w:r>
+              <w:rPr>
+                <w:rFonts w:ascii="Times New Roman" w:eastAsia="Times New Roman" w:hAnsi="Times New Roman" w:cs="Times New Roman"/>
+                <w:color w:val="000000"/>
+                <w:kern w:val="0"/>
+                <w:sz w:val="20"/>
+                <w:szCs w:val="20"/>
+                <w:lang w:eastAsia="es-AR"/>
+                <w14:ligatures w14:val="none"/>
+              </w:rPr>
+              <w:t>cupoMaximo</w:t>
+            </w:r>
+            <w:proofErr w:type="spellEnd"/>
+            <w:r>
+              <w:rPr>
+                <w:rFonts w:ascii="Times New Roman" w:eastAsia="Times New Roman" w:hAnsi="Times New Roman" w:cs="Times New Roman"/>
+                <w:color w:val="000000"/>
+                <w:kern w:val="0"/>
+                <w:sz w:val="20"/>
+                <w:szCs w:val="20"/>
+                <w:lang w:eastAsia="es-AR"/>
+                <w14:ligatures w14:val="none"/>
+              </w:rPr>
+              <w:t xml:space="preserve">: </w:t>
+            </w:r>
+            <w:proofErr w:type="spellStart"/>
+            <w:r>
+              <w:rPr>
+                <w:rFonts w:ascii="Times New Roman" w:eastAsia="Times New Roman" w:hAnsi="Times New Roman" w:cs="Times New Roman"/>
+                <w:color w:val="000000"/>
+                <w:kern w:val="0"/>
+                <w:sz w:val="20"/>
+                <w:szCs w:val="20"/>
+                <w:lang w:eastAsia="es-AR"/>
+                <w14:ligatures w14:val="none"/>
+              </w:rPr>
+              <w:t>int</w:t>
+            </w:r>
+            <w:proofErr w:type="spellEnd"/>
           </w:p>
         </w:tc>
       </w:tr>
@@ -1639,7 +2262,47 @@
                 <w:lang w:eastAsia="es-AR"/>
                 <w14:ligatures w14:val="none"/>
               </w:rPr>
-              <w:t>- validarCupoDisponible()</w:t>
+              <w:t xml:space="preserve">- </w:t>
+            </w:r>
+            <w:proofErr w:type="spellStart"/>
+            <w:proofErr w:type="gramStart"/>
+            <w:r>
+              <w:rPr>
+                <w:rFonts w:ascii="Times New Roman" w:eastAsia="Times New Roman" w:hAnsi="Times New Roman" w:cs="Times New Roman"/>
+                <w:color w:val="000000"/>
+                <w:kern w:val="0"/>
+                <w:sz w:val="20"/>
+                <w:szCs w:val="20"/>
+                <w:lang w:eastAsia="es-AR"/>
+                <w14:ligatures w14:val="none"/>
+              </w:rPr>
+              <w:t>validarCupoDisponible</w:t>
+            </w:r>
+            <w:proofErr w:type="spellEnd"/>
+            <w:r>
+              <w:rPr>
+                <w:rFonts w:ascii="Times New Roman" w:eastAsia="Times New Roman" w:hAnsi="Times New Roman" w:cs="Times New Roman"/>
+                <w:color w:val="000000"/>
+                <w:kern w:val="0"/>
+                <w:sz w:val="20"/>
+                <w:szCs w:val="20"/>
+                <w:lang w:eastAsia="es-AR"/>
+                <w14:ligatures w14:val="none"/>
+              </w:rPr>
+              <w:t>(</w:t>
+            </w:r>
+            <w:proofErr w:type="gramEnd"/>
+            <w:r>
+              <w:rPr>
+                <w:rFonts w:ascii="Times New Roman" w:eastAsia="Times New Roman" w:hAnsi="Times New Roman" w:cs="Times New Roman"/>
+                <w:color w:val="000000"/>
+                <w:kern w:val="0"/>
+                <w:sz w:val="20"/>
+                <w:szCs w:val="20"/>
+                <w:lang w:eastAsia="es-AR"/>
+                <w14:ligatures w14:val="none"/>
+              </w:rPr>
+              <w:t>)</w:t>
             </w:r>
           </w:p>
           <w:p>
@@ -1666,7 +2329,47 @@
                 <w:lang w:eastAsia="es-AR"/>
                 <w14:ligatures w14:val="none"/>
               </w:rPr>
-              <w:t>- registrarReserva()</w:t>
+              <w:t xml:space="preserve">- </w:t>
+            </w:r>
+            <w:proofErr w:type="spellStart"/>
+            <w:proofErr w:type="gramStart"/>
+            <w:r>
+              <w:rPr>
+                <w:rFonts w:ascii="Times New Roman" w:eastAsia="Times New Roman" w:hAnsi="Times New Roman" w:cs="Times New Roman"/>
+                <w:color w:val="000000"/>
+                <w:kern w:val="0"/>
+                <w:sz w:val="20"/>
+                <w:szCs w:val="20"/>
+                <w:lang w:eastAsia="es-AR"/>
+                <w14:ligatures w14:val="none"/>
+              </w:rPr>
+              <w:t>registrarReserva</w:t>
+            </w:r>
+            <w:proofErr w:type="spellEnd"/>
+            <w:r>
+              <w:rPr>
+                <w:rFonts w:ascii="Times New Roman" w:eastAsia="Times New Roman" w:hAnsi="Times New Roman" w:cs="Times New Roman"/>
+                <w:color w:val="000000"/>
+                <w:kern w:val="0"/>
+                <w:sz w:val="20"/>
+                <w:szCs w:val="20"/>
+                <w:lang w:eastAsia="es-AR"/>
+                <w14:ligatures w14:val="none"/>
+              </w:rPr>
+              <w:t>(</w:t>
+            </w:r>
+            <w:proofErr w:type="gramEnd"/>
+            <w:r>
+              <w:rPr>
+                <w:rFonts w:ascii="Times New Roman" w:eastAsia="Times New Roman" w:hAnsi="Times New Roman" w:cs="Times New Roman"/>
+                <w:color w:val="000000"/>
+                <w:kern w:val="0"/>
+                <w:sz w:val="20"/>
+                <w:szCs w:val="20"/>
+                <w:lang w:eastAsia="es-AR"/>
+                <w14:ligatures w14:val="none"/>
+              </w:rPr>
+              <w:t>)</w:t>
             </w:r>
           </w:p>
           <w:p>
@@ -1693,7 +2396,47 @@
                 <w:lang w:eastAsia="es-AR"/>
                 <w14:ligatures w14:val="none"/>
               </w:rPr>
-              <w:t>- verificarAsistencia()</w:t>
+              <w:t xml:space="preserve">- </w:t>
+            </w:r>
+            <w:proofErr w:type="spellStart"/>
+            <w:proofErr w:type="gramStart"/>
+            <w:r>
+              <w:rPr>
+                <w:rFonts w:ascii="Times New Roman" w:eastAsia="Times New Roman" w:hAnsi="Times New Roman" w:cs="Times New Roman"/>
+                <w:color w:val="000000"/>
+                <w:kern w:val="0"/>
+                <w:sz w:val="20"/>
+                <w:szCs w:val="20"/>
+                <w:lang w:eastAsia="es-AR"/>
+                <w14:ligatures w14:val="none"/>
+              </w:rPr>
+              <w:t>verificarAsistencia</w:t>
+            </w:r>
+            <w:proofErr w:type="spellEnd"/>
+            <w:r>
+              <w:rPr>
+                <w:rFonts w:ascii="Times New Roman" w:eastAsia="Times New Roman" w:hAnsi="Times New Roman" w:cs="Times New Roman"/>
+                <w:color w:val="000000"/>
+                <w:kern w:val="0"/>
+                <w:sz w:val="20"/>
+                <w:szCs w:val="20"/>
+                <w:lang w:eastAsia="es-AR"/>
+                <w14:ligatures w14:val="none"/>
+              </w:rPr>
+              <w:t>(</w:t>
+            </w:r>
+            <w:proofErr w:type="gramEnd"/>
+            <w:r>
+              <w:rPr>
+                <w:rFonts w:ascii="Times New Roman" w:eastAsia="Times New Roman" w:hAnsi="Times New Roman" w:cs="Times New Roman"/>
+                <w:color w:val="000000"/>
+                <w:kern w:val="0"/>
+                <w:sz w:val="20"/>
+                <w:szCs w:val="20"/>
+                <w:lang w:eastAsia="es-AR"/>
+                <w14:ligatures w14:val="none"/>
+              </w:rPr>
+              <w:t>)</w:t>
             </w:r>
           </w:p>
         </w:tc>
@@ -1832,6 +2575,7 @@
               </w:rPr>
               <w:t>&lt;</w:t>
             </w:r>
+            <w:proofErr w:type="spellStart"/>
             <w:r>
               <w:rPr>
                 <w:rFonts w:ascii="Times New Roman" w:eastAsia="Times New Roman" w:hAnsi="Times New Roman" w:cs="Times New Roman"/>
@@ -1844,6 +2588,7 @@
               </w:rPr>
               <w:t>listaSocio</w:t>
             </w:r>
+            <w:proofErr w:type="spellEnd"/>
             <w:r>
               <w:rPr>
                 <w:rFonts w:ascii="Times New Roman" w:eastAsia="Times New Roman" w:hAnsi="Times New Roman" w:cs="Times New Roman"/>
@@ -1891,6 +2636,7 @@
               </w:rPr>
               <w:t>&lt;</w:t>
             </w:r>
+            <w:proofErr w:type="spellStart"/>
             <w:r>
               <w:rPr>
                 <w:rFonts w:ascii="Times New Roman" w:eastAsia="Times New Roman" w:hAnsi="Times New Roman" w:cs="Times New Roman"/>
@@ -1903,6 +2649,7 @@
               </w:rPr>
               <w:t>listaProfesor</w:t>
             </w:r>
+            <w:proofErr w:type="spellEnd"/>
             <w:r>
               <w:rPr>
                 <w:rFonts w:ascii="Times New Roman" w:eastAsia="Times New Roman" w:hAnsi="Times New Roman" w:cs="Times New Roman"/>
@@ -1953,6 +2700,7 @@
               </w:rPr>
               <w:t>&lt;</w:t>
             </w:r>
+            <w:proofErr w:type="spellStart"/>
             <w:r>
               <w:rPr>
                 <w:rFonts w:ascii="Times New Roman" w:eastAsia="Times New Roman" w:hAnsi="Times New Roman" w:cs="Times New Roman"/>
@@ -1965,6 +2713,8 @@
               </w:rPr>
               <w:t>listaTurno</w:t>
             </w:r>
+            <w:proofErr w:type="spellEnd"/>
+            <w:proofErr w:type="gramStart"/>
             <w:r>
               <w:rPr>
                 <w:rFonts w:ascii="Times New Roman" w:eastAsia="Times New Roman" w:hAnsi="Times New Roman" w:cs="Times New Roman"/>
@@ -1989,6 +2739,7 @@
               </w:rPr>
               <w:t>:turno</w:t>
             </w:r>
+            <w:proofErr w:type="gramEnd"/>
           </w:p>
           <w:p>
             <w:pPr>
@@ -2009,6 +2760,7 @@
               </w:rPr>
               <w:t>&lt;</w:t>
             </w:r>
+            <w:proofErr w:type="spellStart"/>
             <w:r>
               <w:rPr>
                 <w:rFonts w:ascii="Times New Roman" w:eastAsia="Times New Roman" w:hAnsi="Times New Roman" w:cs="Times New Roman"/>
@@ -2018,6 +2770,8 @@
               </w:rPr>
               <w:t>listaInscripcion</w:t>
             </w:r>
+            <w:proofErr w:type="spellEnd"/>
+            <w:proofErr w:type="gramStart"/>
             <w:r>
               <w:rPr>
                 <w:rFonts w:ascii="Times New Roman" w:eastAsia="Times New Roman" w:hAnsi="Times New Roman" w:cs="Times New Roman"/>
@@ -2034,8 +2788,20 @@
                 <w:lang w:eastAsia="es-AR"/>
                 <w14:ligatures w14:val="none"/>
               </w:rPr>
-              <w:t>:inscripcion</w:t>
-            </w:r>
+              <w:t>:</w:t>
+            </w:r>
+            <w:proofErr w:type="spellStart"/>
+            <w:r>
+              <w:rPr>
+                <w:rFonts w:ascii="Times New Roman" w:eastAsia="Times New Roman" w:hAnsi="Times New Roman" w:cs="Times New Roman"/>
+                <w:kern w:val="0"/>
+                <w:lang w:eastAsia="es-AR"/>
+                <w14:ligatures w14:val="none"/>
+              </w:rPr>
+              <w:t>inscripcion</w:t>
+            </w:r>
+            <w:proofErr w:type="spellEnd"/>
+            <w:proofErr w:type="gramEnd"/>
           </w:p>
         </w:tc>
       </w:tr>
@@ -2082,17 +2848,45 @@
               </w:rPr>
               <w:t xml:space="preserve">- </w:t>
             </w:r>
-            <w:r>
-              <w:rPr>
-                <w:rFonts w:ascii="Times New Roman" w:eastAsia="Times New Roman" w:hAnsi="Times New Roman" w:cs="Times New Roman"/>
-                <w:color w:val="000000"/>
-                <w:kern w:val="0"/>
-                <w:sz w:val="20"/>
-                <w:szCs w:val="20"/>
-                <w:lang w:eastAsia="es-AR"/>
-                <w14:ligatures w14:val="none"/>
-              </w:rPr>
-              <w:t>registrarSocio()</w:t>
+            <w:proofErr w:type="spellStart"/>
+            <w:proofErr w:type="gramStart"/>
+            <w:r>
+              <w:rPr>
+                <w:rFonts w:ascii="Times New Roman" w:eastAsia="Times New Roman" w:hAnsi="Times New Roman" w:cs="Times New Roman"/>
+                <w:color w:val="000000"/>
+                <w:kern w:val="0"/>
+                <w:sz w:val="20"/>
+                <w:szCs w:val="20"/>
+                <w:lang w:eastAsia="es-AR"/>
+                <w14:ligatures w14:val="none"/>
+              </w:rPr>
+              <w:t>registrarSocio</w:t>
+            </w:r>
+            <w:proofErr w:type="spellEnd"/>
+            <w:r>
+              <w:rPr>
+                <w:rFonts w:ascii="Times New Roman" w:eastAsia="Times New Roman" w:hAnsi="Times New Roman" w:cs="Times New Roman"/>
+                <w:color w:val="000000"/>
+                <w:kern w:val="0"/>
+                <w:sz w:val="20"/>
+                <w:szCs w:val="20"/>
+                <w:lang w:eastAsia="es-AR"/>
+                <w14:ligatures w14:val="none"/>
+              </w:rPr>
+              <w:t>(</w:t>
+            </w:r>
+            <w:proofErr w:type="gramEnd"/>
+            <w:r>
+              <w:rPr>
+                <w:rFonts w:ascii="Times New Roman" w:eastAsia="Times New Roman" w:hAnsi="Times New Roman" w:cs="Times New Roman"/>
+                <w:color w:val="000000"/>
+                <w:kern w:val="0"/>
+                <w:sz w:val="20"/>
+                <w:szCs w:val="20"/>
+                <w:lang w:eastAsia="es-AR"/>
+                <w14:ligatures w14:val="none"/>
+              </w:rPr>
+              <w:t>)</w:t>
             </w:r>
           </w:p>
           <w:p>
@@ -2118,7 +2912,47 @@
                 <w:lang w:eastAsia="es-AR"/>
                 <w14:ligatures w14:val="none"/>
               </w:rPr>
-              <w:t>- darDeBajaSocio()</w:t>
+              <w:t xml:space="preserve">- </w:t>
+            </w:r>
+            <w:proofErr w:type="spellStart"/>
+            <w:proofErr w:type="gramStart"/>
+            <w:r>
+              <w:rPr>
+                <w:rFonts w:ascii="Times New Roman" w:eastAsia="Times New Roman" w:hAnsi="Times New Roman" w:cs="Times New Roman"/>
+                <w:color w:val="000000"/>
+                <w:kern w:val="0"/>
+                <w:sz w:val="20"/>
+                <w:szCs w:val="20"/>
+                <w:lang w:eastAsia="es-AR"/>
+                <w14:ligatures w14:val="none"/>
+              </w:rPr>
+              <w:t>darDeBajaSocio</w:t>
+            </w:r>
+            <w:proofErr w:type="spellEnd"/>
+            <w:r>
+              <w:rPr>
+                <w:rFonts w:ascii="Times New Roman" w:eastAsia="Times New Roman" w:hAnsi="Times New Roman" w:cs="Times New Roman"/>
+                <w:color w:val="000000"/>
+                <w:kern w:val="0"/>
+                <w:sz w:val="20"/>
+                <w:szCs w:val="20"/>
+                <w:lang w:eastAsia="es-AR"/>
+                <w14:ligatures w14:val="none"/>
+              </w:rPr>
+              <w:t>(</w:t>
+            </w:r>
+            <w:proofErr w:type="gramEnd"/>
+            <w:r>
+              <w:rPr>
+                <w:rFonts w:ascii="Times New Roman" w:eastAsia="Times New Roman" w:hAnsi="Times New Roman" w:cs="Times New Roman"/>
+                <w:color w:val="000000"/>
+                <w:kern w:val="0"/>
+                <w:sz w:val="20"/>
+                <w:szCs w:val="20"/>
+                <w:lang w:eastAsia="es-AR"/>
+                <w14:ligatures w14:val="none"/>
+              </w:rPr>
+              <w:t>)</w:t>
             </w:r>
           </w:p>
           <w:p>
@@ -2144,7 +2978,47 @@
                 <w:lang w:eastAsia="es-AR"/>
                 <w14:ligatures w14:val="none"/>
               </w:rPr>
-              <w:t>- registrarProfesor()</w:t>
+              <w:t xml:space="preserve">- </w:t>
+            </w:r>
+            <w:proofErr w:type="spellStart"/>
+            <w:proofErr w:type="gramStart"/>
+            <w:r>
+              <w:rPr>
+                <w:rFonts w:ascii="Times New Roman" w:eastAsia="Times New Roman" w:hAnsi="Times New Roman" w:cs="Times New Roman"/>
+                <w:color w:val="000000"/>
+                <w:kern w:val="0"/>
+                <w:sz w:val="20"/>
+                <w:szCs w:val="20"/>
+                <w:lang w:eastAsia="es-AR"/>
+                <w14:ligatures w14:val="none"/>
+              </w:rPr>
+              <w:t>registrarProfesor</w:t>
+            </w:r>
+            <w:proofErr w:type="spellEnd"/>
+            <w:r>
+              <w:rPr>
+                <w:rFonts w:ascii="Times New Roman" w:eastAsia="Times New Roman" w:hAnsi="Times New Roman" w:cs="Times New Roman"/>
+                <w:color w:val="000000"/>
+                <w:kern w:val="0"/>
+                <w:sz w:val="20"/>
+                <w:szCs w:val="20"/>
+                <w:lang w:eastAsia="es-AR"/>
+                <w14:ligatures w14:val="none"/>
+              </w:rPr>
+              <w:t>(</w:t>
+            </w:r>
+            <w:proofErr w:type="gramEnd"/>
+            <w:r>
+              <w:rPr>
+                <w:rFonts w:ascii="Times New Roman" w:eastAsia="Times New Roman" w:hAnsi="Times New Roman" w:cs="Times New Roman"/>
+                <w:color w:val="000000"/>
+                <w:kern w:val="0"/>
+                <w:sz w:val="20"/>
+                <w:szCs w:val="20"/>
+                <w:lang w:eastAsia="es-AR"/>
+                <w14:ligatures w14:val="none"/>
+              </w:rPr>
+              <w:t>)</w:t>
             </w:r>
           </w:p>
           <w:p>
@@ -2170,7 +3044,47 @@
                 <w:lang w:eastAsia="es-AR"/>
                 <w14:ligatures w14:val="none"/>
               </w:rPr>
-              <w:t>- darDeBajaProfesor()</w:t>
+              <w:t xml:space="preserve">- </w:t>
+            </w:r>
+            <w:proofErr w:type="spellStart"/>
+            <w:proofErr w:type="gramStart"/>
+            <w:r>
+              <w:rPr>
+                <w:rFonts w:ascii="Times New Roman" w:eastAsia="Times New Roman" w:hAnsi="Times New Roman" w:cs="Times New Roman"/>
+                <w:color w:val="000000"/>
+                <w:kern w:val="0"/>
+                <w:sz w:val="20"/>
+                <w:szCs w:val="20"/>
+                <w:lang w:eastAsia="es-AR"/>
+                <w14:ligatures w14:val="none"/>
+              </w:rPr>
+              <w:t>darDeBajaProfesor</w:t>
+            </w:r>
+            <w:proofErr w:type="spellEnd"/>
+            <w:r>
+              <w:rPr>
+                <w:rFonts w:ascii="Times New Roman" w:eastAsia="Times New Roman" w:hAnsi="Times New Roman" w:cs="Times New Roman"/>
+                <w:color w:val="000000"/>
+                <w:kern w:val="0"/>
+                <w:sz w:val="20"/>
+                <w:szCs w:val="20"/>
+                <w:lang w:eastAsia="es-AR"/>
+                <w14:ligatures w14:val="none"/>
+              </w:rPr>
+              <w:t>(</w:t>
+            </w:r>
+            <w:proofErr w:type="gramEnd"/>
+            <w:r>
+              <w:rPr>
+                <w:rFonts w:ascii="Times New Roman" w:eastAsia="Times New Roman" w:hAnsi="Times New Roman" w:cs="Times New Roman"/>
+                <w:color w:val="000000"/>
+                <w:kern w:val="0"/>
+                <w:sz w:val="20"/>
+                <w:szCs w:val="20"/>
+                <w:lang w:eastAsia="es-AR"/>
+                <w14:ligatures w14:val="none"/>
+              </w:rPr>
+              <w:t>)</w:t>
             </w:r>
           </w:p>
           <w:p>
@@ -2196,7 +3110,47 @@
                 <w:lang w:eastAsia="es-AR"/>
                 <w14:ligatures w14:val="none"/>
               </w:rPr>
-              <w:t>- registrarInscripcion()</w:t>
+              <w:t xml:space="preserve">- </w:t>
+            </w:r>
+            <w:proofErr w:type="spellStart"/>
+            <w:proofErr w:type="gramStart"/>
+            <w:r>
+              <w:rPr>
+                <w:rFonts w:ascii="Times New Roman" w:eastAsia="Times New Roman" w:hAnsi="Times New Roman" w:cs="Times New Roman"/>
+                <w:color w:val="000000"/>
+                <w:kern w:val="0"/>
+                <w:sz w:val="20"/>
+                <w:szCs w:val="20"/>
+                <w:lang w:eastAsia="es-AR"/>
+                <w14:ligatures w14:val="none"/>
+              </w:rPr>
+              <w:t>registrarInscripcion</w:t>
+            </w:r>
+            <w:proofErr w:type="spellEnd"/>
+            <w:r>
+              <w:rPr>
+                <w:rFonts w:ascii="Times New Roman" w:eastAsia="Times New Roman" w:hAnsi="Times New Roman" w:cs="Times New Roman"/>
+                <w:color w:val="000000"/>
+                <w:kern w:val="0"/>
+                <w:sz w:val="20"/>
+                <w:szCs w:val="20"/>
+                <w:lang w:eastAsia="es-AR"/>
+                <w14:ligatures w14:val="none"/>
+              </w:rPr>
+              <w:t>(</w:t>
+            </w:r>
+            <w:proofErr w:type="gramEnd"/>
+            <w:r>
+              <w:rPr>
+                <w:rFonts w:ascii="Times New Roman" w:eastAsia="Times New Roman" w:hAnsi="Times New Roman" w:cs="Times New Roman"/>
+                <w:color w:val="000000"/>
+                <w:kern w:val="0"/>
+                <w:sz w:val="20"/>
+                <w:szCs w:val="20"/>
+                <w:lang w:eastAsia="es-AR"/>
+                <w14:ligatures w14:val="none"/>
+              </w:rPr>
+              <w:t>)</w:t>
             </w:r>
           </w:p>
           <w:p>
@@ -2222,7 +3176,47 @@
                 <w:lang w:eastAsia="es-AR"/>
                 <w14:ligatures w14:val="none"/>
               </w:rPr>
-              <w:t>- registrarTurno()</w:t>
+              <w:t xml:space="preserve">- </w:t>
+            </w:r>
+            <w:proofErr w:type="spellStart"/>
+            <w:proofErr w:type="gramStart"/>
+            <w:r>
+              <w:rPr>
+                <w:rFonts w:ascii="Times New Roman" w:eastAsia="Times New Roman" w:hAnsi="Times New Roman" w:cs="Times New Roman"/>
+                <w:color w:val="000000"/>
+                <w:kern w:val="0"/>
+                <w:sz w:val="20"/>
+                <w:szCs w:val="20"/>
+                <w:lang w:eastAsia="es-AR"/>
+                <w14:ligatures w14:val="none"/>
+              </w:rPr>
+              <w:t>registrarTurno</w:t>
+            </w:r>
+            <w:proofErr w:type="spellEnd"/>
+            <w:r>
+              <w:rPr>
+                <w:rFonts w:ascii="Times New Roman" w:eastAsia="Times New Roman" w:hAnsi="Times New Roman" w:cs="Times New Roman"/>
+                <w:color w:val="000000"/>
+                <w:kern w:val="0"/>
+                <w:sz w:val="20"/>
+                <w:szCs w:val="20"/>
+                <w:lang w:eastAsia="es-AR"/>
+                <w14:ligatures w14:val="none"/>
+              </w:rPr>
+              <w:t>(</w:t>
+            </w:r>
+            <w:proofErr w:type="gramEnd"/>
+            <w:r>
+              <w:rPr>
+                <w:rFonts w:ascii="Times New Roman" w:eastAsia="Times New Roman" w:hAnsi="Times New Roman" w:cs="Times New Roman"/>
+                <w:color w:val="000000"/>
+                <w:kern w:val="0"/>
+                <w:sz w:val="20"/>
+                <w:szCs w:val="20"/>
+                <w:lang w:eastAsia="es-AR"/>
+                <w14:ligatures w14:val="none"/>
+              </w:rPr>
+              <w:t>)</w:t>
             </w:r>
           </w:p>
           <w:p>
@@ -2248,7 +3242,47 @@
                 <w:lang w:eastAsia="es-AR"/>
                 <w14:ligatures w14:val="none"/>
               </w:rPr>
-              <w:t>- buscarSocio()</w:t>
+              <w:t xml:space="preserve">- </w:t>
+            </w:r>
+            <w:proofErr w:type="spellStart"/>
+            <w:proofErr w:type="gramStart"/>
+            <w:r>
+              <w:rPr>
+                <w:rFonts w:ascii="Times New Roman" w:eastAsia="Times New Roman" w:hAnsi="Times New Roman" w:cs="Times New Roman"/>
+                <w:color w:val="000000"/>
+                <w:kern w:val="0"/>
+                <w:sz w:val="20"/>
+                <w:szCs w:val="20"/>
+                <w:lang w:eastAsia="es-AR"/>
+                <w14:ligatures w14:val="none"/>
+              </w:rPr>
+              <w:t>buscarSocio</w:t>
+            </w:r>
+            <w:proofErr w:type="spellEnd"/>
+            <w:r>
+              <w:rPr>
+                <w:rFonts w:ascii="Times New Roman" w:eastAsia="Times New Roman" w:hAnsi="Times New Roman" w:cs="Times New Roman"/>
+                <w:color w:val="000000"/>
+                <w:kern w:val="0"/>
+                <w:sz w:val="20"/>
+                <w:szCs w:val="20"/>
+                <w:lang w:eastAsia="es-AR"/>
+                <w14:ligatures w14:val="none"/>
+              </w:rPr>
+              <w:t>(</w:t>
+            </w:r>
+            <w:proofErr w:type="gramEnd"/>
+            <w:r>
+              <w:rPr>
+                <w:rFonts w:ascii="Times New Roman" w:eastAsia="Times New Roman" w:hAnsi="Times New Roman" w:cs="Times New Roman"/>
+                <w:color w:val="000000"/>
+                <w:kern w:val="0"/>
+                <w:sz w:val="20"/>
+                <w:szCs w:val="20"/>
+                <w:lang w:eastAsia="es-AR"/>
+                <w14:ligatures w14:val="none"/>
+              </w:rPr>
+              <w:t>)</w:t>
             </w:r>
           </w:p>
           <w:p>
@@ -2274,7 +3308,47 @@
                 <w:lang w:eastAsia="es-AR"/>
                 <w14:ligatures w14:val="none"/>
               </w:rPr>
-              <w:t>- buscarTurno()</w:t>
+              <w:t xml:space="preserve">- </w:t>
+            </w:r>
+            <w:proofErr w:type="spellStart"/>
+            <w:proofErr w:type="gramStart"/>
+            <w:r>
+              <w:rPr>
+                <w:rFonts w:ascii="Times New Roman" w:eastAsia="Times New Roman" w:hAnsi="Times New Roman" w:cs="Times New Roman"/>
+                <w:color w:val="000000"/>
+                <w:kern w:val="0"/>
+                <w:sz w:val="20"/>
+                <w:szCs w:val="20"/>
+                <w:lang w:eastAsia="es-AR"/>
+                <w14:ligatures w14:val="none"/>
+              </w:rPr>
+              <w:t>buscarTurno</w:t>
+            </w:r>
+            <w:proofErr w:type="spellEnd"/>
+            <w:r>
+              <w:rPr>
+                <w:rFonts w:ascii="Times New Roman" w:eastAsia="Times New Roman" w:hAnsi="Times New Roman" w:cs="Times New Roman"/>
+                <w:color w:val="000000"/>
+                <w:kern w:val="0"/>
+                <w:sz w:val="20"/>
+                <w:szCs w:val="20"/>
+                <w:lang w:eastAsia="es-AR"/>
+                <w14:ligatures w14:val="none"/>
+              </w:rPr>
+              <w:t>(</w:t>
+            </w:r>
+            <w:proofErr w:type="gramEnd"/>
+            <w:r>
+              <w:rPr>
+                <w:rFonts w:ascii="Times New Roman" w:eastAsia="Times New Roman" w:hAnsi="Times New Roman" w:cs="Times New Roman"/>
+                <w:color w:val="000000"/>
+                <w:kern w:val="0"/>
+                <w:sz w:val="20"/>
+                <w:szCs w:val="20"/>
+                <w:lang w:eastAsia="es-AR"/>
+                <w14:ligatures w14:val="none"/>
+              </w:rPr>
+              <w:t>)</w:t>
             </w:r>
           </w:p>
           <w:p>
@@ -2665,7 +3739,11 @@
         <w:t>:</w:t>
       </w:r>
       <w:r>
-        <w:t xml:space="preserve"> porque la inscripción debe indicar qué plan contrató el socio. El Plan contiene las características generales, como la frecuencia, duración y precio. Esto también justifica por qué no ponemos el precio </w:t>
+        <w:t xml:space="preserve"> porque la inscripción debe indicar qué plan contrató el socio. El Plan contiene las características generales, como la frecuencia, </w:t>
+      </w:r>
+      <w:r>
+        <w:lastRenderedPageBreak/>
+        <w:t xml:space="preserve">duración y precio. Esto también justifica por qué no ponemos el precio </w:t>
       </w:r>
       <w:r>
         <w:t>directamente como</w:t>
@@ -2674,11 +3752,7 @@
         <w:t xml:space="preserve"> característica principal de Inscripción</w:t>
       </w:r>
       <w:r>
-        <w:t xml:space="preserve">, ya que el precio </w:t>
-      </w:r>
-      <w:r>
-        <w:lastRenderedPageBreak/>
-        <w:t>base pertenece al Plan, mientras que la inscripción puede calcular el precio final teniendo en cuenta el descuento.</w:t>
+        <w:t>, ya que el precio base pertenece al Plan, mientras que la inscripción puede calcular el precio final teniendo en cuenta el descuento.</w:t>
       </w:r>
     </w:p>
     <w:p>
@@ -2929,7 +4003,6 @@
           <w:b/>
           <w:bCs/>
         </w:rPr>
-        <w:lastRenderedPageBreak/>
         <w:t>Distribución de responsabilidades</w:t>
       </w:r>
       <w:r>

</xml_diff>

<commit_message>
agregado flujo logico del sistema (soy pedro)
</commit_message>
<xml_diff>
--- a/Sprint1prog2/Justificacion_Sprint _1.doc.docx
+++ b/Sprint1prog2/Justificacion_Sprint _1.doc.docx
@@ -116,7 +116,13 @@
         </w:numPr>
       </w:pPr>
       <w:r>
-        <w:t>Construir una primera versión funcional de a aplicación. (sin interfaz gráfica) No se evaluará Ia cantidad de código escrito, sino Ia calidad del diseño realizado.</w:t>
+        <w:t xml:space="preserve">Construir una primera versión funcional de </w:t>
+      </w:r>
+      <w:r>
+        <w:t>l</w:t>
+      </w:r>
+      <w:r>
+        <w:t>a aplicación. (sin interfaz gráfica) No se evaluará Ia cantidad de código escrito, sino Ia calidad del diseño realizado.</w:t>
       </w:r>
     </w:p>
     <w:p>
@@ -2093,7 +2099,31 @@
                 <w:lang w:eastAsia="es-AR"/>
                 <w14:ligatures w14:val="none"/>
               </w:rPr>
-              <w:t>listoSocio</w:t>
+              <w:t>list</w:t>
+            </w:r>
+            <w:r>
+              <w:rPr>
+                <w:rFonts w:ascii="Times New Roman" w:eastAsia="Times New Roman" w:hAnsi="Times New Roman" w:cs="Times New Roman"/>
+                <w:color w:val="000000"/>
+                <w:kern w:val="0"/>
+                <w:sz w:val="20"/>
+                <w:szCs w:val="20"/>
+                <w:lang w:eastAsia="es-AR"/>
+                <w14:ligatures w14:val="none"/>
+              </w:rPr>
+              <w:t>a</w:t>
+            </w:r>
+            <w:r>
+              <w:rPr>
+                <w:rFonts w:ascii="Times New Roman" w:eastAsia="Times New Roman" w:hAnsi="Times New Roman" w:cs="Times New Roman"/>
+                <w:color w:val="000000"/>
+                <w:kern w:val="0"/>
+                <w:sz w:val="20"/>
+                <w:szCs w:val="20"/>
+                <w:lang w:eastAsia="es-AR"/>
+                <w14:ligatures w14:val="none"/>
+              </w:rPr>
+              <w:t>Socio</w:t>
             </w:r>
             <w:proofErr w:type="spellEnd"/>
             <w:r>
@@ -2714,32 +2744,18 @@
               <w:t>listaTurno</w:t>
             </w:r>
             <w:proofErr w:type="spellEnd"/>
-            <w:proofErr w:type="gramStart"/>
-            <w:r>
-              <w:rPr>
-                <w:rFonts w:ascii="Times New Roman" w:eastAsia="Times New Roman" w:hAnsi="Times New Roman" w:cs="Times New Roman"/>
-                <w:color w:val="000000"/>
-                <w:kern w:val="0"/>
-                <w:sz w:val="20"/>
-                <w:szCs w:val="20"/>
-                <w:lang w:eastAsia="es-AR"/>
-                <w14:ligatures w14:val="none"/>
-              </w:rPr>
-              <w:t>&gt;</w:t>
-            </w:r>
-            <w:r>
-              <w:rPr>
-                <w:rFonts w:ascii="Times New Roman" w:eastAsia="Times New Roman" w:hAnsi="Times New Roman" w:cs="Times New Roman"/>
-                <w:color w:val="000000"/>
-                <w:kern w:val="0"/>
-                <w:sz w:val="20"/>
-                <w:szCs w:val="20"/>
-                <w:lang w:eastAsia="es-AR"/>
-                <w14:ligatures w14:val="none"/>
-              </w:rPr>
-              <w:t>:turno</w:t>
-            </w:r>
-            <w:proofErr w:type="gramEnd"/>
+            <w:r>
+              <w:rPr>
+                <w:rFonts w:ascii="Times New Roman" w:eastAsia="Times New Roman" w:hAnsi="Times New Roman" w:cs="Times New Roman"/>
+                <w:color w:val="000000"/>
+                <w:kern w:val="0"/>
+                <w:sz w:val="20"/>
+                <w:szCs w:val="20"/>
+                <w:lang w:eastAsia="es-AR"/>
+                <w14:ligatures w14:val="none"/>
+              </w:rPr>
+              <w:t>&gt;: turno</w:t>
+            </w:r>
           </w:p>
           <w:p>
             <w:pPr>
@@ -3368,8 +3384,6 @@
     <w:p/>
     <w:p/>
     <w:p/>
-    <w:p/>
-    <w:p/>
     <w:p>
       <w:pPr>
         <w:rPr>
@@ -3384,6 +3398,7 @@
           <w:bCs/>
           <w:u w:val="single"/>
         </w:rPr>
+        <w:lastRenderedPageBreak/>
         <w:t>Justificaciones:</w:t>
       </w:r>
     </w:p>
@@ -3739,20 +3754,20 @@
         <w:t>:</w:t>
       </w:r>
       <w:r>
-        <w:t xml:space="preserve"> porque la inscripción debe indicar qué plan contrató el socio. El Plan contiene las características generales, como la frecuencia, </w:t>
+        <w:t xml:space="preserve"> porque la inscripción debe indicar qué plan contrató el socio. El Plan contiene las características generales, como la frecuencia, duración y precio. Esto también justifica por qué no ponemos el precio </w:t>
+      </w:r>
+      <w:r>
+        <w:t>directamente como</w:t>
+      </w:r>
+      <w:r>
+        <w:t xml:space="preserve"> característica principal de Inscripción</w:t>
+      </w:r>
+      <w:r>
+        <w:t xml:space="preserve">, ya que el precio </w:t>
       </w:r>
       <w:r>
         <w:lastRenderedPageBreak/>
-        <w:t xml:space="preserve">duración y precio. Esto también justifica por qué no ponemos el precio </w:t>
-      </w:r>
-      <w:r>
-        <w:t>directamente como</w:t>
-      </w:r>
-      <w:r>
-        <w:t xml:space="preserve"> característica principal de Inscripción</w:t>
-      </w:r>
-      <w:r>
-        <w:t>, ya que el precio base pertenece al Plan, mientras que la inscripción puede calcular el precio final teniendo en cuenta el descuento.</w:t>
+        <w:t>base pertenece al Plan, mientras que la inscripción puede calcular el precio final teniendo en cuenta el descuento.</w:t>
       </w:r>
     </w:p>
     <w:p>
@@ -4003,6 +4018,7 @@
           <w:b/>
           <w:bCs/>
         </w:rPr>
+        <w:lastRenderedPageBreak/>
         <w:t>Distribución de responsabilidades</w:t>
       </w:r>
       <w:r>
@@ -4168,6 +4184,503 @@
           <w:rFonts w:asciiTheme="minorHAnsi" w:hAnsiTheme="minorHAnsi"/>
         </w:rPr>
         <w:t>Esta distribución permite mantener las responsabilidades separadas, facilita la comprensión del sistema y evita concentrar toda la lógica en una única clase. Además, permite que cada clase pueda modificarse o ampliarse sin afectar innecesariamente al resto del sistema.</w:t>
+      </w:r>
+    </w:p>
+    <w:p>
+      <w:pPr>
+        <w:pStyle w:val="NormalWeb"/>
+        <w:rPr>
+          <w:rFonts w:asciiTheme="minorHAnsi" w:hAnsiTheme="minorHAnsi"/>
+        </w:rPr>
+      </w:pPr>
+    </w:p>
+    <w:p>
+      <w:pPr>
+        <w:pStyle w:val="NormalWeb"/>
+        <w:rPr>
+          <w:rFonts w:asciiTheme="minorHAnsi" w:hAnsiTheme="minorHAnsi"/>
+          <w:b/>
+          <w:bCs/>
+          <w:u w:val="single"/>
+        </w:rPr>
+      </w:pPr>
+      <w:r>
+        <w:rPr>
+          <w:rFonts w:asciiTheme="minorHAnsi" w:hAnsiTheme="minorHAnsi"/>
+          <w:b/>
+          <w:bCs/>
+          <w:u w:val="single"/>
+        </w:rPr>
+        <w:t>Flujo lógico del sistema:</w:t>
+      </w:r>
+    </w:p>
+    <w:p>
+      <w:pPr>
+        <w:pStyle w:val="NormalWeb"/>
+        <w:rPr>
+          <w:rFonts w:asciiTheme="minorHAnsi" w:hAnsiTheme="minorHAnsi"/>
+        </w:rPr>
+      </w:pPr>
+      <w:r>
+        <w:rPr>
+          <w:rFonts w:asciiTheme="minorHAnsi" w:hAnsiTheme="minorHAnsi"/>
+          <w:noProof/>
+          <w14:ligatures w14:val="standardContextual"/>
+        </w:rPr>
+        <mc:AlternateContent>
+          <mc:Choice Requires="wps">
+            <w:drawing>
+              <wp:anchor distT="0" distB="0" distL="114300" distR="114300" simplePos="0" relativeHeight="251659264" behindDoc="0" locked="0" layoutInCell="1" allowOverlap="1" wp14:anchorId="382B06B8" wp14:editId="4838FC30">
+                <wp:simplePos x="0" y="0"/>
+                <wp:positionH relativeFrom="column">
+                  <wp:posOffset>196215</wp:posOffset>
+                </wp:positionH>
+                <wp:positionV relativeFrom="paragraph">
+                  <wp:posOffset>259080</wp:posOffset>
+                </wp:positionV>
+                <wp:extent cx="0" cy="390525"/>
+                <wp:effectExtent l="76200" t="0" r="57150" b="47625"/>
+                <wp:wrapNone/>
+                <wp:docPr id="1944177185" name="Conector recto de flecha 2"/>
+                <wp:cNvGraphicFramePr/>
+                <a:graphic xmlns:a="http://schemas.openxmlformats.org/drawingml/2006/main">
+                  <a:graphicData uri="http://schemas.microsoft.com/office/word/2010/wordprocessingShape">
+                    <wps:wsp>
+                      <wps:cNvCnPr/>
+                      <wps:spPr>
+                        <a:xfrm>
+                          <a:off x="0" y="0"/>
+                          <a:ext cx="0" cy="390525"/>
+                        </a:xfrm>
+                        <a:prstGeom prst="straightConnector1">
+                          <a:avLst/>
+                        </a:prstGeom>
+                        <a:ln>
+                          <a:tailEnd type="triangle"/>
+                        </a:ln>
+                      </wps:spPr>
+                      <wps:style>
+                        <a:lnRef idx="1">
+                          <a:schemeClr val="accent1"/>
+                        </a:lnRef>
+                        <a:fillRef idx="0">
+                          <a:schemeClr val="accent1"/>
+                        </a:fillRef>
+                        <a:effectRef idx="0">
+                          <a:schemeClr val="accent1"/>
+                        </a:effectRef>
+                        <a:fontRef idx="minor">
+                          <a:schemeClr val="tx1"/>
+                        </a:fontRef>
+                      </wps:style>
+                      <wps:bodyPr/>
+                    </wps:wsp>
+                  </a:graphicData>
+                </a:graphic>
+              </wp:anchor>
+            </w:drawing>
+          </mc:Choice>
+          <mc:Fallback>
+            <w:pict>
+              <v:shapetype w14:anchorId="5061C050" id="_x0000_t32" coordsize="21600,21600" o:spt="32" o:oned="t" path="m,l21600,21600e" filled="f">
+                <v:path arrowok="t" fillok="f" o:connecttype="none"/>
+                <o:lock v:ext="edit" shapetype="t"/>
+              </v:shapetype>
+              <v:shape id="Conector recto de flecha 2" o:spid="_x0000_s1026" type="#_x0000_t32" style="position:absolute;margin-left:15.45pt;margin-top:20.4pt;width:0;height:30.75pt;z-index:251659264;visibility:visible;mso-wrap-style:square;mso-wrap-distance-left:9pt;mso-wrap-distance-top:0;mso-wrap-distance-right:9pt;mso-wrap-distance-bottom:0;mso-position-horizontal:absolute;mso-position-horizontal-relative:text;mso-position-vertical:absolute;mso-position-vertical-relative:text" o:gfxdata="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" strokecolor="#156082 [3204]" strokeweight=".5pt">
+                <v:stroke endarrow="block" joinstyle="miter"/>
+              </v:shape>
+            </w:pict>
+          </mc:Fallback>
+        </mc:AlternateContent>
+      </w:r>
+      <w:r>
+        <w:rPr>
+          <w:rFonts w:asciiTheme="minorHAnsi" w:hAnsiTheme="minorHAnsi"/>
+        </w:rPr>
+        <w:t>Socio</w:t>
+      </w:r>
+    </w:p>
+    <w:p>
+      <w:pPr>
+        <w:pStyle w:val="NormalWeb"/>
+        <w:rPr>
+          <w:rFonts w:asciiTheme="minorHAnsi" w:hAnsiTheme="minorHAnsi"/>
+        </w:rPr>
+      </w:pPr>
+    </w:p>
+    <w:p>
+      <w:pPr>
+        <w:pStyle w:val="NormalWeb"/>
+        <w:rPr>
+          <w:rFonts w:asciiTheme="minorHAnsi" w:hAnsiTheme="minorHAnsi"/>
+        </w:rPr>
+      </w:pPr>
+      <w:r>
+        <w:rPr>
+          <w:rFonts w:asciiTheme="minorHAnsi" w:hAnsiTheme="minorHAnsi"/>
+          <w:noProof/>
+          <w14:ligatures w14:val="standardContextual"/>
+        </w:rPr>
+        <mc:AlternateContent>
+          <mc:Choice Requires="wps">
+            <w:drawing>
+              <wp:anchor distT="0" distB="0" distL="114300" distR="114300" simplePos="0" relativeHeight="251661312" behindDoc="0" locked="0" layoutInCell="1" allowOverlap="1" wp14:anchorId="622C27B6" wp14:editId="077C3BF3">
+                <wp:simplePos x="0" y="0"/>
+                <wp:positionH relativeFrom="margin">
+                  <wp:posOffset>219075</wp:posOffset>
+                </wp:positionH>
+                <wp:positionV relativeFrom="paragraph">
+                  <wp:posOffset>306705</wp:posOffset>
+                </wp:positionV>
+                <wp:extent cx="0" cy="390525"/>
+                <wp:effectExtent l="76200" t="0" r="57150" b="47625"/>
+                <wp:wrapNone/>
+                <wp:docPr id="237659185" name="Conector recto de flecha 2"/>
+                <wp:cNvGraphicFramePr/>
+                <a:graphic xmlns:a="http://schemas.openxmlformats.org/drawingml/2006/main">
+                  <a:graphicData uri="http://schemas.microsoft.com/office/word/2010/wordprocessingShape">
+                    <wps:wsp>
+                      <wps:cNvCnPr/>
+                      <wps:spPr>
+                        <a:xfrm>
+                          <a:off x="0" y="0"/>
+                          <a:ext cx="0" cy="390525"/>
+                        </a:xfrm>
+                        <a:prstGeom prst="straightConnector1">
+                          <a:avLst/>
+                        </a:prstGeom>
+                        <a:ln>
+                          <a:tailEnd type="triangle"/>
+                        </a:ln>
+                      </wps:spPr>
+                      <wps:style>
+                        <a:lnRef idx="1">
+                          <a:schemeClr val="accent1"/>
+                        </a:lnRef>
+                        <a:fillRef idx="0">
+                          <a:schemeClr val="accent1"/>
+                        </a:fillRef>
+                        <a:effectRef idx="0">
+                          <a:schemeClr val="accent1"/>
+                        </a:effectRef>
+                        <a:fontRef idx="minor">
+                          <a:schemeClr val="tx1"/>
+                        </a:fontRef>
+                      </wps:style>
+                      <wps:bodyPr/>
+                    </wps:wsp>
+                  </a:graphicData>
+                </a:graphic>
+              </wp:anchor>
+            </w:drawing>
+          </mc:Choice>
+          <mc:Fallback>
+            <w:pict>
+              <v:shape w14:anchorId="72A5D0B4" id="Conector recto de flecha 2" o:spid="_x0000_s1026" type="#_x0000_t32" style="position:absolute;margin-left:17.25pt;margin-top:24.15pt;width:0;height:30.75pt;z-index:251661312;visibility:visible;mso-wrap-style:square;mso-wrap-distance-left:9pt;mso-wrap-distance-top:0;mso-wrap-distance-right:9pt;mso-wrap-distance-bottom:0;mso-position-horizontal:absolute;mso-position-horizontal-relative:margin;mso-position-vertical:absolute;mso-position-vertical-relative:text" o:gfxdata="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" strokecolor="#156082 [3204]" strokeweight=".5pt">
+                <v:stroke endarrow="block" joinstyle="miter"/>
+                <w10:wrap anchorx="margin"/>
+              </v:shape>
+            </w:pict>
+          </mc:Fallback>
+        </mc:AlternateContent>
+      </w:r>
+      <w:r>
+        <w:rPr>
+          <w:rFonts w:asciiTheme="minorHAnsi" w:hAnsiTheme="minorHAnsi"/>
+        </w:rPr>
+        <w:t>Inscripción</w:t>
+      </w:r>
+    </w:p>
+    <w:p>
+      <w:pPr>
+        <w:pStyle w:val="NormalWeb"/>
+        <w:rPr>
+          <w:rFonts w:asciiTheme="minorHAnsi" w:hAnsiTheme="minorHAnsi"/>
+        </w:rPr>
+      </w:pPr>
+    </w:p>
+    <w:p>
+      <w:pPr>
+        <w:pStyle w:val="NormalWeb"/>
+        <w:rPr>
+          <w:rFonts w:asciiTheme="minorHAnsi" w:hAnsiTheme="minorHAnsi"/>
+        </w:rPr>
+      </w:pPr>
+      <w:r>
+        <w:rPr>
+          <w:rFonts w:asciiTheme="minorHAnsi" w:hAnsiTheme="minorHAnsi"/>
+          <w:noProof/>
+          <w14:ligatures w14:val="standardContextual"/>
+        </w:rPr>
+        <mc:AlternateContent>
+          <mc:Choice Requires="wps">
+            <w:drawing>
+              <wp:anchor distT="0" distB="0" distL="114300" distR="114300" simplePos="0" relativeHeight="251662336" behindDoc="0" locked="0" layoutInCell="1" allowOverlap="1" wp14:anchorId="73AFF86A" wp14:editId="715AB171">
+                <wp:simplePos x="0" y="0"/>
+                <wp:positionH relativeFrom="column">
+                  <wp:posOffset>253365</wp:posOffset>
+                </wp:positionH>
+                <wp:positionV relativeFrom="paragraph">
+                  <wp:posOffset>241935</wp:posOffset>
+                </wp:positionV>
+                <wp:extent cx="0" cy="342900"/>
+                <wp:effectExtent l="76200" t="0" r="76200" b="57150"/>
+                <wp:wrapNone/>
+                <wp:docPr id="1976997828" name="Conector recto de flecha 3"/>
+                <wp:cNvGraphicFramePr/>
+                <a:graphic xmlns:a="http://schemas.openxmlformats.org/drawingml/2006/main">
+                  <a:graphicData uri="http://schemas.microsoft.com/office/word/2010/wordprocessingShape">
+                    <wps:wsp>
+                      <wps:cNvCnPr/>
+                      <wps:spPr>
+                        <a:xfrm>
+                          <a:off x="0" y="0"/>
+                          <a:ext cx="0" cy="342900"/>
+                        </a:xfrm>
+                        <a:prstGeom prst="straightConnector1">
+                          <a:avLst/>
+                        </a:prstGeom>
+                        <a:ln>
+                          <a:tailEnd type="triangle"/>
+                        </a:ln>
+                      </wps:spPr>
+                      <wps:style>
+                        <a:lnRef idx="1">
+                          <a:schemeClr val="accent1"/>
+                        </a:lnRef>
+                        <a:fillRef idx="0">
+                          <a:schemeClr val="accent1"/>
+                        </a:fillRef>
+                        <a:effectRef idx="0">
+                          <a:schemeClr val="accent1"/>
+                        </a:effectRef>
+                        <a:fontRef idx="minor">
+                          <a:schemeClr val="tx1"/>
+                        </a:fontRef>
+                      </wps:style>
+                      <wps:bodyPr/>
+                    </wps:wsp>
+                  </a:graphicData>
+                </a:graphic>
+              </wp:anchor>
+            </w:drawing>
+          </mc:Choice>
+          <mc:Fallback>
+            <w:pict>
+              <v:shape w14:anchorId="61BD2830" id="Conector recto de flecha 3" o:spid="_x0000_s1026" type="#_x0000_t32" style="position:absolute;margin-left:19.95pt;margin-top:19.05pt;width:0;height:27pt;z-index:251662336;visibility:visible;mso-wrap-style:square;mso-wrap-distance-left:9pt;mso-wrap-distance-top:0;mso-wrap-distance-right:9pt;mso-wrap-distance-bottom:0;mso-position-horizontal:absolute;mso-position-horizontal-relative:text;mso-position-vertical:absolute;mso-position-vertical-relative:text" o:gfxdata="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" strokecolor="#156082 [3204]" strokeweight=".5pt">
+                <v:stroke endarrow="block" joinstyle="miter"/>
+              </v:shape>
+            </w:pict>
+          </mc:Fallback>
+        </mc:AlternateContent>
+      </w:r>
+      <w:r>
+        <w:rPr>
+          <w:rFonts w:asciiTheme="minorHAnsi" w:hAnsiTheme="minorHAnsi"/>
+        </w:rPr>
+        <w:t>Plan</w:t>
+      </w:r>
+    </w:p>
+    <w:p>
+      <w:pPr>
+        <w:pStyle w:val="NormalWeb"/>
+        <w:rPr>
+          <w:rFonts w:asciiTheme="minorHAnsi" w:hAnsiTheme="minorHAnsi"/>
+        </w:rPr>
+      </w:pPr>
+    </w:p>
+    <w:p>
+      <w:pPr>
+        <w:pStyle w:val="NormalWeb"/>
+        <w:rPr>
+          <w:rFonts w:asciiTheme="minorHAnsi" w:hAnsiTheme="minorHAnsi"/>
+        </w:rPr>
+      </w:pPr>
+      <w:r>
+        <w:rPr>
+          <w:rFonts w:asciiTheme="minorHAnsi" w:hAnsiTheme="minorHAnsi"/>
+          <w:noProof/>
+          <w14:ligatures w14:val="standardContextual"/>
+        </w:rPr>
+        <mc:AlternateContent>
+          <mc:Choice Requires="wps">
+            <w:drawing>
+              <wp:anchor distT="0" distB="0" distL="114300" distR="114300" simplePos="0" relativeHeight="251663360" behindDoc="0" locked="0" layoutInCell="1" allowOverlap="1" wp14:anchorId="590EFEA0" wp14:editId="71F33236">
+                <wp:simplePos x="0" y="0"/>
+                <wp:positionH relativeFrom="column">
+                  <wp:posOffset>253365</wp:posOffset>
+                </wp:positionH>
+                <wp:positionV relativeFrom="paragraph">
+                  <wp:posOffset>247650</wp:posOffset>
+                </wp:positionV>
+                <wp:extent cx="0" cy="400050"/>
+                <wp:effectExtent l="76200" t="0" r="57150" b="57150"/>
+                <wp:wrapNone/>
+                <wp:docPr id="2122655891" name="Conector recto de flecha 4"/>
+                <wp:cNvGraphicFramePr/>
+                <a:graphic xmlns:a="http://schemas.openxmlformats.org/drawingml/2006/main">
+                  <a:graphicData uri="http://schemas.microsoft.com/office/word/2010/wordprocessingShape">
+                    <wps:wsp>
+                      <wps:cNvCnPr/>
+                      <wps:spPr>
+                        <a:xfrm>
+                          <a:off x="0" y="0"/>
+                          <a:ext cx="0" cy="400050"/>
+                        </a:xfrm>
+                        <a:prstGeom prst="straightConnector1">
+                          <a:avLst/>
+                        </a:prstGeom>
+                        <a:ln>
+                          <a:tailEnd type="triangle"/>
+                        </a:ln>
+                      </wps:spPr>
+                      <wps:style>
+                        <a:lnRef idx="1">
+                          <a:schemeClr val="accent1"/>
+                        </a:lnRef>
+                        <a:fillRef idx="0">
+                          <a:schemeClr val="accent1"/>
+                        </a:fillRef>
+                        <a:effectRef idx="0">
+                          <a:schemeClr val="accent1"/>
+                        </a:effectRef>
+                        <a:fontRef idx="minor">
+                          <a:schemeClr val="tx1"/>
+                        </a:fontRef>
+                      </wps:style>
+                      <wps:bodyPr/>
+                    </wps:wsp>
+                  </a:graphicData>
+                </a:graphic>
+              </wp:anchor>
+            </w:drawing>
+          </mc:Choice>
+          <mc:Fallback>
+            <w:pict>
+              <v:shape w14:anchorId="721E5603" id="Conector recto de flecha 4" o:spid="_x0000_s1026" type="#_x0000_t32" style="position:absolute;margin-left:19.95pt;margin-top:19.5pt;width:0;height:31.5pt;z-index:251663360;visibility:visible;mso-wrap-style:square;mso-wrap-distance-left:9pt;mso-wrap-distance-top:0;mso-wrap-distance-right:9pt;mso-wrap-distance-bottom:0;mso-position-horizontal:absolute;mso-position-horizontal-relative:text;mso-position-vertical:absolute;mso-position-vertical-relative:text" o:gfxdata="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" strokecolor="#156082 [3204]" strokeweight=".5pt">
+                <v:stroke endarrow="block" joinstyle="miter"/>
+              </v:shape>
+            </w:pict>
+          </mc:Fallback>
+        </mc:AlternateContent>
+      </w:r>
+      <w:r>
+        <w:rPr>
+          <w:rFonts w:asciiTheme="minorHAnsi" w:hAnsiTheme="minorHAnsi"/>
+        </w:rPr>
+        <w:t>Turno</w:t>
+      </w:r>
+    </w:p>
+    <w:p>
+      <w:pPr>
+        <w:pStyle w:val="NormalWeb"/>
+        <w:rPr>
+          <w:rFonts w:asciiTheme="minorHAnsi" w:hAnsiTheme="minorHAnsi"/>
+        </w:rPr>
+      </w:pPr>
+    </w:p>
+    <w:p>
+      <w:pPr>
+        <w:pStyle w:val="NormalWeb"/>
+        <w:rPr>
+          <w:rFonts w:asciiTheme="minorHAnsi" w:hAnsiTheme="minorHAnsi"/>
+        </w:rPr>
+      </w:pPr>
+      <w:r>
+        <w:rPr>
+          <w:rFonts w:asciiTheme="minorHAnsi" w:hAnsiTheme="minorHAnsi"/>
+          <w:noProof/>
+          <w14:ligatures w14:val="standardContextual"/>
+        </w:rPr>
+        <mc:AlternateContent>
+          <mc:Choice Requires="wps">
+            <w:drawing>
+              <wp:anchor distT="0" distB="0" distL="114300" distR="114300" simplePos="0" relativeHeight="251664384" behindDoc="0" locked="0" layoutInCell="1" allowOverlap="1" wp14:anchorId="16AF9491" wp14:editId="66BB8D58">
+                <wp:simplePos x="0" y="0"/>
+                <wp:positionH relativeFrom="column">
+                  <wp:posOffset>262890</wp:posOffset>
+                </wp:positionH>
+                <wp:positionV relativeFrom="paragraph">
+                  <wp:posOffset>224790</wp:posOffset>
+                </wp:positionV>
+                <wp:extent cx="0" cy="400050"/>
+                <wp:effectExtent l="76200" t="0" r="57150" b="57150"/>
+                <wp:wrapNone/>
+                <wp:docPr id="306506934" name="Conector recto de flecha 5"/>
+                <wp:cNvGraphicFramePr/>
+                <a:graphic xmlns:a="http://schemas.openxmlformats.org/drawingml/2006/main">
+                  <a:graphicData uri="http://schemas.microsoft.com/office/word/2010/wordprocessingShape">
+                    <wps:wsp>
+                      <wps:cNvCnPr/>
+                      <wps:spPr>
+                        <a:xfrm>
+                          <a:off x="0" y="0"/>
+                          <a:ext cx="0" cy="400050"/>
+                        </a:xfrm>
+                        <a:prstGeom prst="straightConnector1">
+                          <a:avLst/>
+                        </a:prstGeom>
+                        <a:ln>
+                          <a:tailEnd type="triangle"/>
+                        </a:ln>
+                      </wps:spPr>
+                      <wps:style>
+                        <a:lnRef idx="1">
+                          <a:schemeClr val="accent1"/>
+                        </a:lnRef>
+                        <a:fillRef idx="0">
+                          <a:schemeClr val="accent1"/>
+                        </a:fillRef>
+                        <a:effectRef idx="0">
+                          <a:schemeClr val="accent1"/>
+                        </a:effectRef>
+                        <a:fontRef idx="minor">
+                          <a:schemeClr val="tx1"/>
+                        </a:fontRef>
+                      </wps:style>
+                      <wps:bodyPr/>
+                    </wps:wsp>
+                  </a:graphicData>
+                </a:graphic>
+              </wp:anchor>
+            </w:drawing>
+          </mc:Choice>
+          <mc:Fallback>
+            <w:pict>
+              <v:shape w14:anchorId="54637D5B" id="Conector recto de flecha 5" o:spid="_x0000_s1026" type="#_x0000_t32" style="position:absolute;margin-left:20.7pt;margin-top:17.7pt;width:0;height:31.5pt;z-index:251664384;visibility:visible;mso-wrap-style:square;mso-wrap-distance-left:9pt;mso-wrap-distance-top:0;mso-wrap-distance-right:9pt;mso-wrap-distance-bottom:0;mso-position-horizontal:absolute;mso-position-horizontal-relative:text;mso-position-vertical:absolute;mso-position-vertical-relative:text" o:gfxdata="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" strokecolor="#156082 [3204]" strokeweight=".5pt">
+                <v:stroke endarrow="block" joinstyle="miter"/>
+              </v:shape>
+            </w:pict>
+          </mc:Fallback>
+        </mc:AlternateContent>
+      </w:r>
+      <w:r>
+        <w:rPr>
+          <w:rFonts w:asciiTheme="minorHAnsi" w:hAnsiTheme="minorHAnsi"/>
+        </w:rPr>
+        <w:t>Profesor</w:t>
+      </w:r>
+    </w:p>
+    <w:p>
+      <w:pPr>
+        <w:pStyle w:val="NormalWeb"/>
+        <w:rPr>
+          <w:rFonts w:asciiTheme="minorHAnsi" w:hAnsiTheme="minorHAnsi"/>
+        </w:rPr>
+      </w:pPr>
+    </w:p>
+    <w:p>
+      <w:pPr>
+        <w:pStyle w:val="NormalWeb"/>
+        <w:rPr>
+          <w:rFonts w:asciiTheme="minorHAnsi" w:hAnsiTheme="minorHAnsi"/>
+        </w:rPr>
+      </w:pPr>
+      <w:r>
+        <w:rPr>
+          <w:rFonts w:asciiTheme="minorHAnsi" w:hAnsiTheme="minorHAnsi"/>
+        </w:rPr>
+        <w:t>Sistema</w:t>
       </w:r>
     </w:p>
     <w:p>

</xml_diff>

<commit_message>
Se agrega link al repositorio
</commit_message>
<xml_diff>
--- a/Sprint1prog2/Justificacion_Sprint _1.doc.docx
+++ b/Sprint1prog2/Justificacion_Sprint _1.doc.docx
@@ -511,6 +511,7 @@
               <w:rPr>
                 <w:rFonts w:ascii="Times New Roman" w:eastAsia="Times New Roman" w:hAnsi="Times New Roman" w:cs="Times New Roman"/>
                 <w:kern w:val="0"/>
+                <w:highlight w:val="yellow"/>
                 <w:lang w:eastAsia="es-AR"/>
                 <w14:ligatures w14:val="none"/>
               </w:rPr>
@@ -557,6 +558,7 @@
                 <w:kern w:val="0"/>
                 <w:sz w:val="20"/>
                 <w:szCs w:val="20"/>
+                <w:highlight w:val="yellow"/>
                 <w:lang w:eastAsia="es-AR"/>
                 <w14:ligatures w14:val="none"/>
               </w:rPr>
@@ -570,6 +572,7 @@
                 <w:kern w:val="0"/>
                 <w:sz w:val="20"/>
                 <w:szCs w:val="20"/>
+                <w:highlight w:val="yellow"/>
                 <w:lang w:eastAsia="es-AR"/>
                 <w14:ligatures w14:val="none"/>
               </w:rPr>
@@ -583,6 +586,7 @@
                 <w:kern w:val="0"/>
                 <w:sz w:val="20"/>
                 <w:szCs w:val="20"/>
+                <w:highlight w:val="yellow"/>
                 <w:lang w:eastAsia="es-AR"/>
                 <w14:ligatures w14:val="none"/>
               </w:rPr>
@@ -2083,6 +2087,7 @@
                 <w:kern w:val="0"/>
                 <w:sz w:val="20"/>
                 <w:szCs w:val="20"/>
+                <w:highlight w:val="yellow"/>
                 <w:lang w:eastAsia="es-AR"/>
                 <w14:ligatures w14:val="none"/>
               </w:rPr>
@@ -2096,6 +2101,7 @@
                 <w:kern w:val="0"/>
                 <w:sz w:val="20"/>
                 <w:szCs w:val="20"/>
+                <w:highlight w:val="yellow"/>
                 <w:lang w:eastAsia="es-AR"/>
                 <w14:ligatures w14:val="none"/>
               </w:rPr>
@@ -2108,6 +2114,7 @@
                 <w:kern w:val="0"/>
                 <w:sz w:val="20"/>
                 <w:szCs w:val="20"/>
+                <w:highlight w:val="yellow"/>
                 <w:lang w:eastAsia="es-AR"/>
                 <w14:ligatures w14:val="none"/>
               </w:rPr>
@@ -2120,6 +2127,7 @@
                 <w:kern w:val="0"/>
                 <w:sz w:val="20"/>
                 <w:szCs w:val="20"/>
+                <w:highlight w:val="yellow"/>
                 <w:lang w:eastAsia="es-AR"/>
                 <w14:ligatures w14:val="none"/>
               </w:rPr>
@@ -2133,6 +2141,7 @@
                 <w:kern w:val="0"/>
                 <w:sz w:val="20"/>
                 <w:szCs w:val="20"/>
+                <w:highlight w:val="yellow"/>
                 <w:lang w:eastAsia="es-AR"/>
                 <w14:ligatures w14:val="none"/>
               </w:rPr>
@@ -4682,6 +4691,30 @@
         </w:rPr>
         <w:t>Sistema</w:t>
       </w:r>
+    </w:p>
+    <w:p>
+      <w:pPr>
+        <w:pStyle w:val="NormalWeb"/>
+        <w:rPr>
+          <w:rFonts w:asciiTheme="minorHAnsi" w:hAnsiTheme="minorHAnsi"/>
+        </w:rPr>
+      </w:pPr>
+      <w:r>
+        <w:rPr>
+          <w:rFonts w:asciiTheme="minorHAnsi" w:hAnsiTheme="minorHAnsi"/>
+        </w:rPr>
+        <w:lastRenderedPageBreak/>
+        <w:t xml:space="preserve">Link para ingresar al repositorio: </w:t>
+      </w:r>
+      <w:hyperlink r:id="rId5" w:history="1">
+        <w:r>
+          <w:rPr>
+            <w:rStyle w:val="Hipervnculo"/>
+            <w:rFonts w:asciiTheme="minorHAnsi" w:hAnsiTheme="minorHAnsi"/>
+          </w:rPr>
+          <w:t>https://github.com/zknd64/tpiprogramacionc2.git</w:t>
+        </w:r>
+      </w:hyperlink>
     </w:p>
     <w:p>
       <w:pPr>

</xml_diff>